<commit_message>
Update CV Word and PDF documents.
Co-authored-by: Cursor <cursoragent@cursor.com>
</commit_message>
<xml_diff>
--- a/Maher Mostafa Cv.docx
+++ b/Maher Mostafa Cv.docx
@@ -1,8 +1,8 @@
 
 <file path=word/document.xml><?xml version="1.0" encoding="utf-8"?>
-<w:document xmlns:ns1="http://schemas.microsoft.com/office/word/2010/wordml" xmlns:ns3="http://schemas.openxmlformats.org/markup-compatibility/2006" xmlns:ns4="http://schemas.openxmlformats.org/drawingml/2006/wordprocessingDrawing" xmlns:ns5="http://schemas.openxmlformats.org/drawingml/2006/main" xmlns:ns6="http://schemas.microsoft.com/office/word/2010/wordprocessingShape" xmlns:ns7="http://schemas.openxmlformats.org/drawingml/2006/picture" xmlns:r="http://schemas.openxmlformats.org/officeDocument/2006/relationships" xmlns:w="http://schemas.openxmlformats.org/wordprocessingml/2006/main">
+<w:document xmlns:mc="http://schemas.openxmlformats.org/markup-compatibility/2006" xmlns:o="urn:schemas-microsoft-com:office:office" xmlns:r="http://schemas.openxmlformats.org/officeDocument/2006/relationships" xmlns:m="http://schemas.openxmlformats.org/officeDocument/2006/math" xmlns:v="urn:schemas-microsoft-com:vml" xmlns:wp="http://schemas.openxmlformats.org/drawingml/2006/wordprocessingDrawing" xmlns:w10="urn:schemas-microsoft-com:office:word" xmlns:w="http://schemas.openxmlformats.org/wordprocessingml/2006/main" xmlns:wne="http://schemas.microsoft.com/office/word/2006/wordml" xmlns:sl="http://schemas.openxmlformats.org/schemaLibrary/2006/main" xmlns:a="http://schemas.openxmlformats.org/drawingml/2006/main" xmlns:pic="http://schemas.openxmlformats.org/drawingml/2006/picture" xmlns:c="http://schemas.openxmlformats.org/drawingml/2006/chart" xmlns:lc="http://schemas.openxmlformats.org/drawingml/2006/lockedCanvas" xmlns:dgm="http://schemas.openxmlformats.org/drawingml/2006/diagram" xmlns:wps="http://schemas.microsoft.com/office/word/2010/wordprocessingShape" xmlns:wpg="http://schemas.microsoft.com/office/word/2010/wordprocessingGroup" xmlns:w14="http://schemas.microsoft.com/office/word/2010/wordml" xmlns:w15="http://schemas.microsoft.com/office/word/2012/wordml" xmlns:w16="http://schemas.microsoft.com/office/word/2018/wordml" xmlns:w16cex="http://schemas.microsoft.com/office/word/2018/wordml/cex" xmlns:w16cid="http://schemas.microsoft.com/office/word/2016/wordml/cid" xmlns="http://schemas.microsoft.com/office/tasks/2019/documenttasks" xmlns:cr="http://schemas.microsoft.com/office/comments/2020/reactions">
   <w:body>
-    <w:p ns1:paraId="00000001">
+    <w:p>
       <w:pPr>
         <w:spacing w:before="68" w:line="360" w:lineRule="auto"/>
         <w:ind w:right="11"/>
@@ -27,7 +27,7 @@
         <w:t xml:space="preserve">MAHER MOSTAFA</w:t>
       </w:r>
     </w:p>
-    <w:p ns1:paraId="00000002">
+    <w:p>
       <w:pPr>
         <w:pStyle w:val="Heading1"/>
         <w:spacing w:before="4" w:line="360" w:lineRule="auto"/>
@@ -43,7 +43,7 @@
         <w:t xml:space="preserve">Backend Software Engineer</w:t>
       </w:r>
     </w:p>
-    <w:p ns1:paraId="00000003">
+    <w:p>
       <w:pPr>
         <w:pStyle w:val="Heading1"/>
         <w:spacing w:before="4" w:line="360" w:lineRule="auto"/>
@@ -55,7 +55,7 @@
         </w:rPr>
       </w:r>
     </w:p>
-    <w:p ns1:paraId="00000004">
+    <w:p>
       <w:pPr>
         <w:keepNext w:val="0"/>
         <w:keepLines w:val="0"/>
@@ -123,7 +123,7 @@
           <w:vertAlign w:val="baseline"/>
           <w:rtl w:val="0"/>
         </w:rPr>
-        <w:t xml:space="preserve">: </w:t>
+        <w:t xml:space="preserve">: +2</w:t>
       </w:r>
       <w:hyperlink r:id="rId7">
         <w:r>
@@ -143,7 +143,7 @@
             <w:vertAlign w:val="baseline"/>
             <w:rtl w:val="0"/>
           </w:rPr>
-          <w:t xml:space="preserve">+20 128 597 1377</w:t>
+          <w:t xml:space="preserve">01285971377</w:t>
         </w:r>
       </w:hyperlink>
       <w:r>
@@ -283,7 +283,7 @@
         <w:t xml:space="preserve"> Cairo, Egypt, Gesr-Suez</w:t>
       </w:r>
     </w:p>
-    <w:p ns1:paraId="00000005">
+    <w:p>
       <w:pPr>
         <w:keepNext w:val="0"/>
         <w:keepLines w:val="0"/>
@@ -372,7 +372,7 @@
         </w:rPr>
       </w:r>
     </w:p>
-    <w:p ns1:paraId="00000006">
+    <w:p>
       <w:pPr>
         <w:keepNext w:val="0"/>
         <w:keepLines w:val="0"/>
@@ -470,7 +470,7 @@
         </w:rPr>
       </w:r>
     </w:p>
-    <w:p ns1:paraId="00000007">
+    <w:p>
       <w:pPr>
         <w:pStyle w:val="Heading1"/>
         <w:spacing w:line="360" w:lineRule="auto"/>
@@ -488,42 +488,42 @@
         <w:t xml:space="preserve">Summary</w:t>
       </w:r>
       <w:r>
-        <ns3:AlternateContent>
-          <ns3:Choice Requires="wps">
+        <mc:AlternateContent>
+          <mc:Choice Requires="wps">
             <w:drawing>
-              <ns4:anchor allowOverlap="1" behindDoc="0" distB="0" distT="0" distL="0" distR="0" hidden="0" layoutInCell="1" locked="0" relativeHeight="0" simplePos="0">
-                <ns4:simplePos x="0" y="0"/>
-                <ns4:positionH relativeFrom="column">
-                  <ns4:posOffset>66039</ns4:posOffset>
-                </ns4:positionH>
-                <ns4:positionV relativeFrom="paragraph">
-                  <ns4:posOffset>262890</ns4:posOffset>
-                </ns4:positionV>
-                <ns4:extent cx="8255" cy="12700"/>
-                <ns4:effectExtent b="0" l="0" r="0" t="0"/>
-                <ns4:wrapTopAndBottom distB="0" distT="0"/>
-                <ns4:docPr id="14" name=""/>
-                <ns5:graphic>
-                  <ns5:graphicData uri="http://schemas.microsoft.com/office/word/2010/wordprocessingShape">
-                    <ns6:wsp>
-                      <ns6:cNvSpPr/>
-                      <ns6:cNvPr id="2" name="Shape 2"/>
-                      <ns6:spPr>
-                        <ns5:xfrm>
-                          <ns5:off x="2018918" y="3775873"/>
-                          <ns5:ext cx="6654165" cy="8255"/>
-                        </ns5:xfrm>
-                        <ns5:prstGeom prst="rect">
-                          <ns5:avLst/>
-                        </ns5:prstGeom>
-                        <ns5:solidFill>
-                          <ns5:srgbClr val="000000"/>
-                        </ns5:solidFill>
-                        <ns5:ln>
-                          <ns5:noFill/>
-                        </ns5:ln>
-                      </ns6:spPr>
-                      <ns6:txbx>
+              <wp:anchor allowOverlap="1" behindDoc="0" distB="0" distT="0" distL="0" distR="0" hidden="0" layoutInCell="1" locked="0" relativeHeight="0" simplePos="0">
+                <wp:simplePos x="0" y="0"/>
+                <wp:positionH relativeFrom="column">
+                  <wp:posOffset>66039</wp:posOffset>
+                </wp:positionH>
+                <wp:positionV relativeFrom="paragraph">
+                  <wp:posOffset>262890</wp:posOffset>
+                </wp:positionV>
+                <wp:extent cx="8255" cy="12700"/>
+                <wp:effectExtent b="0" l="0" r="0" t="0"/>
+                <wp:wrapTopAndBottom distB="0" distT="0"/>
+                <wp:docPr id="14" name=""/>
+                <a:graphic>
+                  <a:graphicData uri="http://schemas.microsoft.com/office/word/2010/wordprocessingShape">
+                    <wps:wsp>
+                      <wps:cNvSpPr/>
+                      <wps:cNvPr id="2" name="Shape 2"/>
+                      <wps:spPr>
+                        <a:xfrm>
+                          <a:off x="2018918" y="3775873"/>
+                          <a:ext cx="6654165" cy="8255"/>
+                        </a:xfrm>
+                        <a:prstGeom prst="rect">
+                          <a:avLst/>
+                        </a:prstGeom>
+                        <a:solidFill>
+                          <a:srgbClr val="000000"/>
+                        </a:solidFill>
+                        <a:ln>
+                          <a:noFill/>
+                        </a:ln>
+                      </wps:spPr>
+                      <wps:txbx>
                         <w:txbxContent>
                           <w:p>
                             <w:pPr>
@@ -547,62 +547,62 @@
                             </w:r>
                           </w:p>
                         </w:txbxContent>
-                      </ns6:txbx>
-                      <ns6:bodyPr anchorCtr="0" anchor="t" bIns="45700" lIns="91425" spcFirstLastPara="1" rIns="91425" wrap="square" tIns="45700">
-                        <ns5:noAutofit/>
-                      </ns6:bodyPr>
-                    </ns6:wsp>
-                  </ns5:graphicData>
-                </ns5:graphic>
-              </ns4:anchor>
+                      </wps:txbx>
+                      <wps:bodyPr anchorCtr="0" anchor="t" bIns="45700" lIns="91425" spcFirstLastPara="1" rIns="91425" wrap="square" tIns="45700">
+                        <a:noAutofit/>
+                      </wps:bodyPr>
+                    </wps:wsp>
+                  </a:graphicData>
+                </a:graphic>
+              </wp:anchor>
             </w:drawing>
-          </ns3:Choice>
-          <ns3:Fallback>
+          </mc:Choice>
+          <mc:Fallback>
             <w:drawing>
-              <ns4:anchor allowOverlap="1" behindDoc="0" distB="0" distT="0" distL="0" distR="0" hidden="0" layoutInCell="1" locked="0" relativeHeight="0" simplePos="0">
-                <ns4:simplePos x="0" y="0"/>
-                <ns4:positionH relativeFrom="column">
-                  <ns4:posOffset>66039</ns4:posOffset>
-                </ns4:positionH>
-                <ns4:positionV relativeFrom="paragraph">
-                  <ns4:posOffset>262890</ns4:posOffset>
-                </ns4:positionV>
-                <ns4:extent cx="8255" cy="12700"/>
-                <ns4:effectExtent b="0" l="0" r="0" t="0"/>
-                <ns4:wrapTopAndBottom distB="0" distT="0"/>
-                <ns4:docPr id="14" name="image1.png"/>
-                <ns5:graphic>
-                  <ns5:graphicData uri="http://schemas.openxmlformats.org/drawingml/2006/picture">
-                    <ns7:pic>
-                      <ns7:nvPicPr>
-                        <ns7:cNvPr id="0" name="image1.png"/>
-                        <ns7:cNvPicPr preferRelativeResize="0"/>
-                      </ns7:nvPicPr>
-                      <ns7:blipFill>
-                        <ns5:blip r:embed="rId10"/>
-                        <ns5:srcRect/>
-                        <ns5:stretch>
-                          <ns5:fillRect/>
-                        </ns5:stretch>
-                      </ns7:blipFill>
-                      <ns7:spPr>
-                        <ns5:xfrm>
-                          <ns5:off x="0" y="0"/>
-                          <ns5:ext cx="8255" cy="12700"/>
-                        </ns5:xfrm>
-                        <ns5:prstGeom prst="rect"/>
-                        <ns5:ln/>
-                      </ns7:spPr>
-                    </ns7:pic>
-                  </ns5:graphicData>
-                </ns5:graphic>
-              </ns4:anchor>
+              <wp:anchor allowOverlap="1" behindDoc="0" distB="0" distT="0" distL="0" distR="0" hidden="0" layoutInCell="1" locked="0" relativeHeight="0" simplePos="0">
+                <wp:simplePos x="0" y="0"/>
+                <wp:positionH relativeFrom="column">
+                  <wp:posOffset>66039</wp:posOffset>
+                </wp:positionH>
+                <wp:positionV relativeFrom="paragraph">
+                  <wp:posOffset>262890</wp:posOffset>
+                </wp:positionV>
+                <wp:extent cx="8255" cy="12700"/>
+                <wp:effectExtent b="0" l="0" r="0" t="0"/>
+                <wp:wrapTopAndBottom distB="0" distT="0"/>
+                <wp:docPr id="14" name="image1.png"/>
+                <a:graphic>
+                  <a:graphicData uri="http://schemas.openxmlformats.org/drawingml/2006/picture">
+                    <pic:pic>
+                      <pic:nvPicPr>
+                        <pic:cNvPr id="0" name="image1.png"/>
+                        <pic:cNvPicPr preferRelativeResize="0"/>
+                      </pic:nvPicPr>
+                      <pic:blipFill>
+                        <a:blip r:embed="rId10"/>
+                        <a:srcRect/>
+                        <a:stretch>
+                          <a:fillRect/>
+                        </a:stretch>
+                      </pic:blipFill>
+                      <pic:spPr>
+                        <a:xfrm>
+                          <a:off x="0" y="0"/>
+                          <a:ext cx="8255" cy="12700"/>
+                        </a:xfrm>
+                        <a:prstGeom prst="rect"/>
+                        <a:ln/>
+                      </pic:spPr>
+                    </pic:pic>
+                  </a:graphicData>
+                </a:graphic>
+              </wp:anchor>
             </w:drawing>
-          </ns3:Fallback>
-        </ns3:AlternateContent>
-      </w:r>
-    </w:p>
-    <w:p ns1:paraId="00000008">
+          </mc:Fallback>
+        </mc:AlternateContent>
+      </w:r>
+    </w:p>
+    <w:p>
       <w:pPr>
         <w:keepNext w:val="0"/>
         <w:keepLines w:val="0"/>
@@ -631,7 +631,7 @@
         </w:rPr>
       </w:r>
     </w:p>
-    <w:p ns1:paraId="00000009">
+    <w:p>
       <w:pPr>
         <w:spacing w:before="5" w:line="360" w:lineRule="auto"/>
         <w:rPr>
@@ -655,7 +655,7 @@
         </w:rPr>
       </w:r>
     </w:p>
-    <w:p ns1:paraId="0000000A">
+    <w:p>
       <w:pPr>
         <w:pStyle w:val="Heading1"/>
         <w:spacing w:line="360" w:lineRule="auto"/>
@@ -673,42 +673,42 @@
         <w:t xml:space="preserve">Skills</w:t>
       </w:r>
       <w:r>
-        <ns3:AlternateContent>
-          <ns3:Choice Requires="wps">
+        <mc:AlternateContent>
+          <mc:Choice Requires="wps">
             <w:drawing>
-              <ns4:anchor allowOverlap="1" behindDoc="0" distB="0" distT="0" distL="0" distR="0" hidden="0" layoutInCell="1" locked="0" relativeHeight="0" simplePos="0">
-                <ns4:simplePos x="0" y="0"/>
-                <ns4:positionH relativeFrom="column">
-                  <ns4:posOffset>66039</ns4:posOffset>
-                </ns4:positionH>
-                <ns4:positionV relativeFrom="paragraph">
-                  <ns4:posOffset>262890</ns4:posOffset>
-                </ns4:positionV>
-                <ns4:extent cx="8255" cy="12700"/>
-                <ns4:effectExtent b="0" l="0" r="0" t="0"/>
-                <ns4:wrapTopAndBottom distB="0" distT="0"/>
-                <ns4:docPr id="17" name=""/>
-                <ns5:graphic>
-                  <ns5:graphicData uri="http://schemas.microsoft.com/office/word/2010/wordprocessingShape">
-                    <ns6:wsp>
-                      <ns6:cNvSpPr/>
-                      <ns6:cNvPr id="5" name="Shape 5"/>
-                      <ns6:spPr>
-                        <ns5:xfrm>
-                          <ns5:off x="2018918" y="3775873"/>
-                          <ns5:ext cx="6654165" cy="8255"/>
-                        </ns5:xfrm>
-                        <ns5:prstGeom prst="rect">
-                          <ns5:avLst/>
-                        </ns5:prstGeom>
-                        <ns5:solidFill>
-                          <ns5:srgbClr val="000000"/>
-                        </ns5:solidFill>
-                        <ns5:ln>
-                          <ns5:noFill/>
-                        </ns5:ln>
-                      </ns6:spPr>
-                      <ns6:txbx>
+              <wp:anchor allowOverlap="1" behindDoc="0" distB="0" distT="0" distL="0" distR="0" hidden="0" layoutInCell="1" locked="0" relativeHeight="0" simplePos="0">
+                <wp:simplePos x="0" y="0"/>
+                <wp:positionH relativeFrom="column">
+                  <wp:posOffset>66039</wp:posOffset>
+                </wp:positionH>
+                <wp:positionV relativeFrom="paragraph">
+                  <wp:posOffset>262890</wp:posOffset>
+                </wp:positionV>
+                <wp:extent cx="8255" cy="12700"/>
+                <wp:effectExtent b="0" l="0" r="0" t="0"/>
+                <wp:wrapTopAndBottom distB="0" distT="0"/>
+                <wp:docPr id="17" name=""/>
+                <a:graphic>
+                  <a:graphicData uri="http://schemas.microsoft.com/office/word/2010/wordprocessingShape">
+                    <wps:wsp>
+                      <wps:cNvSpPr/>
+                      <wps:cNvPr id="5" name="Shape 5"/>
+                      <wps:spPr>
+                        <a:xfrm>
+                          <a:off x="2018918" y="3775873"/>
+                          <a:ext cx="6654165" cy="8255"/>
+                        </a:xfrm>
+                        <a:prstGeom prst="rect">
+                          <a:avLst/>
+                        </a:prstGeom>
+                        <a:solidFill>
+                          <a:srgbClr val="000000"/>
+                        </a:solidFill>
+                        <a:ln>
+                          <a:noFill/>
+                        </a:ln>
+                      </wps:spPr>
+                      <wps:txbx>
                         <w:txbxContent>
                           <w:p>
                             <w:pPr>
@@ -719,62 +719,62 @@
                             </w:pPr>
                           </w:p>
                         </w:txbxContent>
-                      </ns6:txbx>
-                      <ns6:bodyPr anchorCtr="0" anchor="ctr" bIns="91425" lIns="91425" spcFirstLastPara="1" rIns="91425" wrap="square" tIns="91425">
-                        <ns5:noAutofit/>
-                      </ns6:bodyPr>
-                    </ns6:wsp>
-                  </ns5:graphicData>
-                </ns5:graphic>
-              </ns4:anchor>
+                      </wps:txbx>
+                      <wps:bodyPr anchorCtr="0" anchor="ctr" bIns="91425" lIns="91425" spcFirstLastPara="1" rIns="91425" wrap="square" tIns="91425">
+                        <a:noAutofit/>
+                      </wps:bodyPr>
+                    </wps:wsp>
+                  </a:graphicData>
+                </a:graphic>
+              </wp:anchor>
             </w:drawing>
-          </ns3:Choice>
-          <ns3:Fallback>
+          </mc:Choice>
+          <mc:Fallback>
             <w:drawing>
-              <ns4:anchor allowOverlap="1" behindDoc="0" distB="0" distT="0" distL="0" distR="0" hidden="0" layoutInCell="1" locked="0" relativeHeight="0" simplePos="0">
-                <ns4:simplePos x="0" y="0"/>
-                <ns4:positionH relativeFrom="column">
-                  <ns4:posOffset>66039</ns4:posOffset>
-                </ns4:positionH>
-                <ns4:positionV relativeFrom="paragraph">
-                  <ns4:posOffset>262890</ns4:posOffset>
-                </ns4:positionV>
-                <ns4:extent cx="8255" cy="12700"/>
-                <ns4:effectExtent b="0" l="0" r="0" t="0"/>
-                <ns4:wrapTopAndBottom distB="0" distT="0"/>
-                <ns4:docPr id="17" name="image4.png"/>
-                <ns5:graphic>
-                  <ns5:graphicData uri="http://schemas.openxmlformats.org/drawingml/2006/picture">
-                    <ns7:pic>
-                      <ns7:nvPicPr>
-                        <ns7:cNvPr id="0" name="image4.png"/>
-                        <ns7:cNvPicPr preferRelativeResize="0"/>
-                      </ns7:nvPicPr>
-                      <ns7:blipFill>
-                        <ns5:blip r:embed="rId10"/>
-                        <ns5:srcRect/>
-                        <ns5:stretch>
-                          <ns5:fillRect/>
-                        </ns5:stretch>
-                      </ns7:blipFill>
-                      <ns7:spPr>
-                        <ns5:xfrm>
-                          <ns5:off x="0" y="0"/>
-                          <ns5:ext cx="8255" cy="12700"/>
-                        </ns5:xfrm>
-                        <ns5:prstGeom prst="rect"/>
-                        <ns5:ln/>
-                      </ns7:spPr>
-                    </ns7:pic>
-                  </ns5:graphicData>
-                </ns5:graphic>
-              </ns4:anchor>
+              <wp:anchor allowOverlap="1" behindDoc="0" distB="0" distT="0" distL="0" distR="0" hidden="0" layoutInCell="1" locked="0" relativeHeight="0" simplePos="0">
+                <wp:simplePos x="0" y="0"/>
+                <wp:positionH relativeFrom="column">
+                  <wp:posOffset>66039</wp:posOffset>
+                </wp:positionH>
+                <wp:positionV relativeFrom="paragraph">
+                  <wp:posOffset>262890</wp:posOffset>
+                </wp:positionV>
+                <wp:extent cx="8255" cy="12700"/>
+                <wp:effectExtent b="0" l="0" r="0" t="0"/>
+                <wp:wrapTopAndBottom distB="0" distT="0"/>
+                <wp:docPr id="17" name="image4.png"/>
+                <a:graphic>
+                  <a:graphicData uri="http://schemas.openxmlformats.org/drawingml/2006/picture">
+                    <pic:pic>
+                      <pic:nvPicPr>
+                        <pic:cNvPr id="0" name="image4.png"/>
+                        <pic:cNvPicPr preferRelativeResize="0"/>
+                      </pic:nvPicPr>
+                      <pic:blipFill>
+                        <a:blip r:embed="rId10"/>
+                        <a:srcRect/>
+                        <a:stretch>
+                          <a:fillRect/>
+                        </a:stretch>
+                      </pic:blipFill>
+                      <pic:spPr>
+                        <a:xfrm>
+                          <a:off x="0" y="0"/>
+                          <a:ext cx="8255" cy="12700"/>
+                        </a:xfrm>
+                        <a:prstGeom prst="rect"/>
+                        <a:ln/>
+                      </pic:spPr>
+                    </pic:pic>
+                  </a:graphicData>
+                </a:graphic>
+              </wp:anchor>
             </w:drawing>
-          </ns3:Fallback>
-        </ns3:AlternateContent>
-      </w:r>
-    </w:p>
-    <w:p ns1:paraId="0000000B">
+          </mc:Fallback>
+        </mc:AlternateContent>
+      </w:r>
+    </w:p>
+    <w:p>
       <w:pPr>
         <w:spacing w:line="360" w:lineRule="auto"/>
         <w:rPr>
@@ -797,7 +797,7 @@
         <w:t xml:space="preserve"> </w:t>
       </w:r>
     </w:p>
-    <w:p ns1:paraId="0000000C">
+    <w:p>
       <w:pPr>
         <w:spacing w:line="360" w:lineRule="auto"/>
         <w:rPr>
@@ -835,7 +835,7 @@
         </w:rPr>
       </w:r>
     </w:p>
-    <w:p ns1:paraId="0000000D">
+    <w:p>
       <w:pPr>
         <w:keepNext w:val="0"/>
         <w:keepLines w:val="0"/>
@@ -859,7 +859,7 @@
       </w:pPr>
       <w:sdt>
         <w:sdtPr>
-          <w:id w:val="957849648"/>
+          <w:id w:val="2056158543"/>
           <w:tag w:val="goog_rdk_0"/>
         </w:sdtPr>
         <w:sdtContent>
@@ -893,7 +893,7 @@
         <w:t xml:space="preserve">: PHP 8.2–8.4, Laravel 11–13, Hypervel/Swoole, Laravel Octane/RoadRunner</w:t>
       </w:r>
     </w:p>
-    <w:p ns1:paraId="0000000E">
+    <w:p>
       <w:pPr>
         <w:spacing w:before="10" w:line="360" w:lineRule="auto"/>
         <w:ind w:left="103" w:firstLine="0"/>
@@ -905,7 +905,7 @@
       </w:pPr>
       <w:sdt>
         <w:sdtPr>
-          <w:id w:val="-1409756469"/>
+          <w:id w:val="-1435145029"/>
           <w:tag w:val="goog_rdk_1"/>
         </w:sdtPr>
         <w:sdtContent>
@@ -947,7 +947,7 @@
         <w:t xml:space="preserve"> PostgreSQL, MySQL, Redis, SQL, REST API design, PostgreSQL JSONB, CTEs, partial indexes, schema-per-tenant design</w:t>
       </w:r>
     </w:p>
-    <w:p ns1:paraId="0000000F">
+    <w:p>
       <w:pPr>
         <w:spacing w:before="10" w:line="360" w:lineRule="auto"/>
         <w:ind w:left="103" w:firstLine="0"/>
@@ -959,7 +959,7 @@
       </w:pPr>
       <w:sdt>
         <w:sdtPr>
-          <w:id w:val="-792496381"/>
+          <w:id w:val="-2001240111"/>
           <w:tag w:val="goog_rdk_2"/>
         </w:sdtPr>
         <w:sdtContent>
@@ -993,7 +993,7 @@
         <w:t xml:space="preserve">: Multi-tenancy, service/repository layers, DTOs, domain enums, compensating transactions, ledger design, Composer package extraction</w:t>
       </w:r>
     </w:p>
-    <w:p ns1:paraId="00000010">
+    <w:p>
       <w:pPr>
         <w:spacing w:before="10" w:line="360" w:lineRule="auto"/>
         <w:ind w:left="103" w:firstLine="0"/>
@@ -1005,7 +1005,7 @@
       </w:pPr>
       <w:sdt>
         <w:sdtPr>
-          <w:id w:val="-1196493148"/>
+          <w:id w:val="76381596"/>
           <w:tag w:val="goog_rdk_3"/>
         </w:sdtPr>
         <w:sdtContent>
@@ -1044,7 +1044,7 @@
         </w:rPr>
       </w:r>
     </w:p>
-    <w:p ns1:paraId="00000011">
+    <w:p>
       <w:pPr>
         <w:pStyle w:val="Heading1"/>
         <w:spacing w:line="360" w:lineRule="auto"/>
@@ -1076,42 +1076,42 @@
         <w:t xml:space="preserve"> </w:t>
       </w:r>
       <w:r>
-        <ns3:AlternateContent>
-          <ns3:Choice Requires="wps">
+        <mc:AlternateContent>
+          <mc:Choice Requires="wps">
             <w:drawing>
-              <ns4:anchor allowOverlap="1" behindDoc="0" distB="0" distT="0" distL="0" distR="0" hidden="0" layoutInCell="1" locked="0" relativeHeight="0" simplePos="0">
-                <ns4:simplePos x="0" y="0"/>
-                <ns4:positionH relativeFrom="column">
-                  <ns4:posOffset>66039</ns4:posOffset>
-                </ns4:positionH>
-                <ns4:positionV relativeFrom="paragraph">
-                  <ns4:posOffset>262890</ns4:posOffset>
-                </ns4:positionV>
-                <ns4:extent cx="8255" cy="12700"/>
-                <ns4:effectExtent b="0" l="0" r="0" t="0"/>
-                <ns4:wrapTopAndBottom distB="0" distT="0"/>
-                <ns4:docPr id="18" name=""/>
-                <ns5:graphic>
-                  <ns5:graphicData uri="http://schemas.microsoft.com/office/word/2010/wordprocessingShape">
-                    <ns6:wsp>
-                      <ns6:cNvSpPr/>
-                      <ns6:cNvPr id="6" name="Shape 6"/>
-                      <ns6:spPr>
-                        <ns5:xfrm>
-                          <ns5:off x="2018918" y="3775873"/>
-                          <ns5:ext cx="6654165" cy="8255"/>
-                        </ns5:xfrm>
-                        <ns5:prstGeom prst="rect">
-                          <ns5:avLst/>
-                        </ns5:prstGeom>
-                        <ns5:solidFill>
-                          <ns5:srgbClr val="000000"/>
-                        </ns5:solidFill>
-                        <ns5:ln>
-                          <ns5:noFill/>
-                        </ns5:ln>
-                      </ns6:spPr>
-                      <ns6:txbx>
+              <wp:anchor allowOverlap="1" behindDoc="0" distB="0" distT="0" distL="0" distR="0" hidden="0" layoutInCell="1" locked="0" relativeHeight="0" simplePos="0">
+                <wp:simplePos x="0" y="0"/>
+                <wp:positionH relativeFrom="column">
+                  <wp:posOffset>66039</wp:posOffset>
+                </wp:positionH>
+                <wp:positionV relativeFrom="paragraph">
+                  <wp:posOffset>262890</wp:posOffset>
+                </wp:positionV>
+                <wp:extent cx="8255" cy="12700"/>
+                <wp:effectExtent b="0" l="0" r="0" t="0"/>
+                <wp:wrapTopAndBottom distB="0" distT="0"/>
+                <wp:docPr id="18" name=""/>
+                <a:graphic>
+                  <a:graphicData uri="http://schemas.microsoft.com/office/word/2010/wordprocessingShape">
+                    <wps:wsp>
+                      <wps:cNvSpPr/>
+                      <wps:cNvPr id="6" name="Shape 6"/>
+                      <wps:spPr>
+                        <a:xfrm>
+                          <a:off x="2018918" y="3775873"/>
+                          <a:ext cx="6654165" cy="8255"/>
+                        </a:xfrm>
+                        <a:prstGeom prst="rect">
+                          <a:avLst/>
+                        </a:prstGeom>
+                        <a:solidFill>
+                          <a:srgbClr val="000000"/>
+                        </a:solidFill>
+                        <a:ln>
+                          <a:noFill/>
+                        </a:ln>
+                      </wps:spPr>
+                      <wps:txbx>
                         <w:txbxContent>
                           <w:p>
                             <w:pPr>
@@ -1122,62 +1122,62 @@
                             </w:pPr>
                           </w:p>
                         </w:txbxContent>
-                      </ns6:txbx>
-                      <ns6:bodyPr anchorCtr="0" anchor="ctr" bIns="91425" lIns="91425" spcFirstLastPara="1" rIns="91425" wrap="square" tIns="91425">
-                        <ns5:noAutofit/>
-                      </ns6:bodyPr>
-                    </ns6:wsp>
-                  </ns5:graphicData>
-                </ns5:graphic>
-              </ns4:anchor>
+                      </wps:txbx>
+                      <wps:bodyPr anchorCtr="0" anchor="ctr" bIns="91425" lIns="91425" spcFirstLastPara="1" rIns="91425" wrap="square" tIns="91425">
+                        <a:noAutofit/>
+                      </wps:bodyPr>
+                    </wps:wsp>
+                  </a:graphicData>
+                </a:graphic>
+              </wp:anchor>
             </w:drawing>
-          </ns3:Choice>
-          <ns3:Fallback>
+          </mc:Choice>
+          <mc:Fallback>
             <w:drawing>
-              <ns4:anchor allowOverlap="1" behindDoc="0" distB="0" distT="0" distL="0" distR="0" hidden="0" layoutInCell="1" locked="0" relativeHeight="0" simplePos="0">
-                <ns4:simplePos x="0" y="0"/>
-                <ns4:positionH relativeFrom="column">
-                  <ns4:posOffset>66039</ns4:posOffset>
-                </ns4:positionH>
-                <ns4:positionV relativeFrom="paragraph">
-                  <ns4:posOffset>262890</ns4:posOffset>
-                </ns4:positionV>
-                <ns4:extent cx="8255" cy="12700"/>
-                <ns4:effectExtent b="0" l="0" r="0" t="0"/>
-                <ns4:wrapTopAndBottom distB="0" distT="0"/>
-                <ns4:docPr id="18" name="image5.png"/>
-                <ns5:graphic>
-                  <ns5:graphicData uri="http://schemas.openxmlformats.org/drawingml/2006/picture">
-                    <ns7:pic>
-                      <ns7:nvPicPr>
-                        <ns7:cNvPr id="0" name="image5.png"/>
-                        <ns7:cNvPicPr preferRelativeResize="0"/>
-                      </ns7:nvPicPr>
-                      <ns7:blipFill>
-                        <ns5:blip r:embed="rId10"/>
-                        <ns5:srcRect/>
-                        <ns5:stretch>
-                          <ns5:fillRect/>
-                        </ns5:stretch>
-                      </ns7:blipFill>
-                      <ns7:spPr>
-                        <ns5:xfrm>
-                          <ns5:off x="0" y="0"/>
-                          <ns5:ext cx="8255" cy="12700"/>
-                        </ns5:xfrm>
-                        <ns5:prstGeom prst="rect"/>
-                        <ns5:ln/>
-                      </ns7:spPr>
-                    </ns7:pic>
-                  </ns5:graphicData>
-                </ns5:graphic>
-              </ns4:anchor>
+              <wp:anchor allowOverlap="1" behindDoc="0" distB="0" distT="0" distL="0" distR="0" hidden="0" layoutInCell="1" locked="0" relativeHeight="0" simplePos="0">
+                <wp:simplePos x="0" y="0"/>
+                <wp:positionH relativeFrom="column">
+                  <wp:posOffset>66039</wp:posOffset>
+                </wp:positionH>
+                <wp:positionV relativeFrom="paragraph">
+                  <wp:posOffset>262890</wp:posOffset>
+                </wp:positionV>
+                <wp:extent cx="8255" cy="12700"/>
+                <wp:effectExtent b="0" l="0" r="0" t="0"/>
+                <wp:wrapTopAndBottom distB="0" distT="0"/>
+                <wp:docPr id="18" name="image5.png"/>
+                <a:graphic>
+                  <a:graphicData uri="http://schemas.openxmlformats.org/drawingml/2006/picture">
+                    <pic:pic>
+                      <pic:nvPicPr>
+                        <pic:cNvPr id="0" name="image5.png"/>
+                        <pic:cNvPicPr preferRelativeResize="0"/>
+                      </pic:nvPicPr>
+                      <pic:blipFill>
+                        <a:blip r:embed="rId10"/>
+                        <a:srcRect/>
+                        <a:stretch>
+                          <a:fillRect/>
+                        </a:stretch>
+                      </pic:blipFill>
+                      <pic:spPr>
+                        <a:xfrm>
+                          <a:off x="0" y="0"/>
+                          <a:ext cx="8255" cy="12700"/>
+                        </a:xfrm>
+                        <a:prstGeom prst="rect"/>
+                        <a:ln/>
+                      </pic:spPr>
+                    </pic:pic>
+                  </a:graphicData>
+                </a:graphic>
+              </wp:anchor>
             </w:drawing>
-          </ns3:Fallback>
-        </ns3:AlternateContent>
-      </w:r>
-    </w:p>
-    <w:p ns1:paraId="00000012">
+          </mc:Fallback>
+        </mc:AlternateContent>
+      </w:r>
+    </w:p>
+    <w:p>
       <w:pPr>
         <w:tabs>
           <w:tab w:val="left" w:leader="none" w:pos="9857"/>
@@ -1237,15 +1237,15 @@
           <w:szCs w:val="17"/>
           <w:rtl w:val="0"/>
         </w:rPr>
-        <w:t xml:space="preserve">On-site (Present)</w:t>
-      </w:r>
-      <w:r>
-        <w:rPr>
-          <w:rtl w:val="0"/>
-        </w:rPr>
-      </w:r>
-    </w:p>
-    <w:p ns1:paraId="00000013">
+        <w:t xml:space="preserve">On-site ( present )</w:t>
+      </w:r>
+      <w:r>
+        <w:rPr>
+          <w:rtl w:val="0"/>
+        </w:rPr>
+      </w:r>
+    </w:p>
+    <w:p>
       <w:pPr>
         <w:pStyle w:val="Heading2"/>
         <w:tabs>
@@ -1284,7 +1284,7 @@
         </w:rPr>
       </w:r>
     </w:p>
-    <w:p ns1:paraId="00000014">
+    <w:p>
       <w:pPr>
         <w:tabs>
           <w:tab w:val="left" w:leader="none" w:pos="9857"/>
@@ -1316,11 +1316,22 @@
           <w:b w:val="1"/>
           <w:bCs w:val="1"/>
           <w:color w:val="6f7878"/>
+          <w:sz w:val="18"/>
+          <w:szCs w:val="18"/>
+          <w:rtl w:val="0"/>
+        </w:rPr>
+        <w:t xml:space="preserve">      </w:t>
+      </w:r>
+      <w:r>
+        <w:rPr>
+          <w:b w:val="1"/>
+          <w:bCs w:val="1"/>
+          <w:color w:val="6f7878"/>
           <w:sz w:val="20"/>
           <w:szCs w:val="20"/>
           <w:rtl w:val="0"/>
         </w:rPr>
-        <w:t xml:space="preserve">                                       </w:t>
+        <w:t xml:space="preserve">                                 </w:t>
       </w:r>
       <w:r>
         <w:rPr>
@@ -1329,15 +1340,15 @@
           <w:szCs w:val="17"/>
           <w:rtl w:val="0"/>
         </w:rPr>
-        <w:t xml:space="preserve">                  Jan 2026</w:t>
-      </w:r>
-      <w:r>
-        <w:rPr>
-          <w:rtl w:val="0"/>
-        </w:rPr>
-      </w:r>
-    </w:p>
-    <w:p ns1:paraId="00000015">
+        <w:t xml:space="preserve">                 Jan 2026</w:t>
+      </w:r>
+      <w:r>
+        <w:rPr>
+          <w:rtl w:val="0"/>
+        </w:rPr>
+      </w:r>
+    </w:p>
+    <w:p>
       <w:pPr>
         <w:tabs>
           <w:tab w:val="left" w:leader="none" w:pos="357"/>
@@ -1360,7 +1371,7 @@
         <w:t xml:space="preserve">• Implemented schema-per-tenant PostgreSQL storage and dynamic connection registration, separating the platform registry from tenant billing schemas.</w:t>
       </w:r>
     </w:p>
-    <w:p ns1:paraId="00000016">
+    <w:p>
       <w:pPr>
         <w:tabs>
           <w:tab w:val="left" w:leader="none" w:pos="357"/>
@@ -1383,7 +1394,7 @@
         <w:t xml:space="preserve">• Built transaction-safe wallet operations with lock checks and conditional balance updates for recharge, conversion, and debit flows.</w:t>
       </w:r>
     </w:p>
-    <w:p ns1:paraId="00000017">
+    <w:p>
       <w:pPr>
         <w:tabs>
           <w:tab w:val="left" w:leader="none" w:pos="357"/>
@@ -1406,7 +1417,7 @@
         <w:t xml:space="preserve">• Added linked ledger reversal records for auditable financial corrections, and deduplicated PayTabs callbacks by charge ID before wallet credit; verified callbacks with HMAC.</w:t>
       </w:r>
     </w:p>
-    <w:p ns1:paraId="00000018">
+    <w:p>
       <w:pPr>
         <w:tabs>
           <w:tab w:val="left" w:leader="none" w:pos="357"/>
@@ -1429,7 +1440,7 @@
         <w:t xml:space="preserve">• Unified four payment providers behind the private hypervel/payments package, separating charge creation, webhook handling, and refunds from billing-domain code.</w:t>
       </w:r>
     </w:p>
-    <w:p ns1:paraId="00000019">
+    <w:p>
       <w:pPr>
         <w:tabs>
           <w:tab w:val="left" w:leader="none" w:pos="357"/>
@@ -1452,7 +1463,7 @@
         <w:t xml:space="preserve">• Built PostgreSQL CTE-based invoicing and credit reports with unit-tested query logic; delivered Docker, health checks, GitHub Actions test gating, semver tagging, and AWS ECR image publishing.</w:t>
       </w:r>
     </w:p>
-    <w:p ns1:paraId="0000001A">
+    <w:p>
       <w:pPr>
         <w:tabs>
           <w:tab w:val="left" w:leader="none" w:pos="9857"/>
@@ -1505,7 +1516,7 @@
         </w:rPr>
       </w:r>
     </w:p>
-    <w:p ns1:paraId="0000001B">
+    <w:p>
       <w:pPr>
         <w:tabs>
           <w:tab w:val="left" w:leader="none" w:pos="357"/>
@@ -1520,7 +1531,7 @@
       </w:pPr>
       <w:sdt>
         <w:sdtPr>
-          <w:id w:val="1084631059"/>
+          <w:id w:val="-417610829"/>
           <w:tag w:val="goog_rdk_4"/>
         </w:sdtPr>
         <w:sdtContent>
@@ -1537,7 +1548,7 @@
         </w:sdtContent>
       </w:sdt>
     </w:p>
-    <w:p ns1:paraId="0000001C">
+    <w:p>
       <w:pPr>
         <w:tabs>
           <w:tab w:val="left" w:leader="none" w:pos="357"/>
@@ -1560,7 +1571,7 @@
         <w:t xml:space="preserve">• Enforced idempotent survey assignment in both the service layer and PostgreSQL partial unique indexes.</w:t>
       </w:r>
     </w:p>
-    <w:p ns1:paraId="0000001D">
+    <w:p>
       <w:pPr>
         <w:tabs>
           <w:tab w:val="left" w:leader="none" w:pos="357"/>
@@ -1583,7 +1594,7 @@
         <w:t xml:space="preserve">• Separated authentication by trust boundary: X-App-Key for server-to-server APIs and HMAC-SHA256 signed tokens for public survey links.</w:t>
       </w:r>
     </w:p>
-    <w:p ns1:paraId="0000001E">
+    <w:p>
       <w:pPr>
         <w:tabs>
           <w:tab w:val="left" w:leader="none" w:pos="357"/>
@@ -1596,9 +1607,32 @@
           <w:szCs w:val="15"/>
         </w:rPr>
       </w:pPr>
+      <w:r>
+        <w:rPr>
+          <w:color w:val="374246"/>
+          <w:sz w:val="15"/>
+          <w:szCs w:val="15"/>
+          <w:rtl w:val="0"/>
+        </w:rPr>
+        <w:t xml:space="preserve">• Implemented metadata-based survey routing with six condition operators, model-level validation for mutually exclusive scopes, and</w:t>
+      </w:r>
+    </w:p>
+    <w:p>
+      <w:pPr>
+        <w:tabs>
+          <w:tab w:val="left" w:leader="none" w:pos="357"/>
+        </w:tabs>
+        <w:spacing w:before="35" w:line="360" w:lineRule="auto"/>
+        <w:ind w:right="921"/>
+        <w:rPr>
+          <w:color w:val="374246"/>
+          <w:sz w:val="15"/>
+          <w:szCs w:val="15"/>
+        </w:rPr>
+      </w:pPr>
       <w:sdt>
         <w:sdtPr>
-          <w:id w:val="-2133819035"/>
+          <w:id w:val="-2039388166"/>
           <w:tag w:val="goog_rdk_5"/>
         </w:sdtPr>
         <w:sdtContent>
@@ -1610,12 +1644,12 @@
               <w:szCs w:val="15"/>
               <w:rtl w:val="0"/>
             </w:rPr>
-            <w:t xml:space="preserve">• Implemented metadata-based survey routing with six condition operators, model-level validation for mutually exclusive scopes, and controllers → services → repositories structure; added 41 automated tests for API flows, token verification, and scope validation.</w:t>
+            <w:t xml:space="preserve">controllers → services → repositories structure; added 41 automated tests for API flows, token verification, and scope validation.</w:t>
           </w:r>
         </w:sdtContent>
       </w:sdt>
     </w:p>
-    <w:p ns1:paraId="0000001F">
+    <w:p>
       <w:pPr>
         <w:tabs>
           <w:tab w:val="left" w:leader="none" w:pos="9857"/>
@@ -1667,7 +1701,7 @@
         </w:rPr>
       </w:r>
     </w:p>
-    <w:p ns1:paraId="00000020">
+    <w:p>
       <w:pPr>
         <w:tabs>
           <w:tab w:val="left" w:leader="none" w:pos="357"/>
@@ -1690,7 +1724,7 @@
         <w:t xml:space="preserve">• Extracted packing-materials logic into a versioned Composer package with a trait-composed service and Facade API for reuse across production applications.</w:t>
       </w:r>
     </w:p>
-    <w:p ns1:paraId="00000021">
+    <w:p>
       <w:pPr>
         <w:tabs>
           <w:tab w:val="left" w:leader="none" w:pos="357"/>
@@ -1713,7 +1747,7 @@
         <w:t xml:space="preserve">• Preserved historical order values by snapshotting unit and total prices at checkout; split carts into per-carrier orders within database transactions to match fulfillment and billing boundaries.</w:t>
       </w:r>
     </w:p>
-    <w:p ns1:paraId="00000022">
+    <w:p>
       <w:pPr>
         <w:tabs>
           <w:tab w:val="left" w:leader="none" w:pos="357"/>
@@ -1736,7 +1770,26 @@
         <w:t xml:space="preserve">• Added polymorphic request/response audit records for carrier integrations without coupling domain models to carrier APIs.</w:t>
       </w:r>
     </w:p>
-    <w:p ns1:paraId="00000023">
+    <w:p>
+      <w:pPr>
+        <w:tabs>
+          <w:tab w:val="left" w:leader="none" w:pos="357"/>
+        </w:tabs>
+        <w:spacing w:before="35" w:line="360" w:lineRule="auto"/>
+        <w:ind w:right="921"/>
+        <w:rPr>
+          <w:color w:val="374246"/>
+          <w:sz w:val="15"/>
+          <w:szCs w:val="15"/>
+        </w:rPr>
+      </w:pPr>
+      <w:r>
+        <w:rPr>
+          <w:rtl w:val="0"/>
+        </w:rPr>
+      </w:r>
+    </w:p>
+    <w:p>
       <w:pPr>
         <w:tabs>
           <w:tab w:val="left" w:leader="none" w:pos="357"/>
@@ -1758,28 +1811,29 @@
           <w:szCs w:val="18"/>
           <w:rtl w:val="0"/>
         </w:rPr>
-        <w:t xml:space="preserve">Bolesa Egypt — Backend Team Contributor | Production Platform: </w:t>
-      </w:r>
-      <w:r>
-        <w:rPr>
-          <w:rtl w:val="0"/>
-        </w:rPr>
-      </w:r>
-      <w:hyperlink r:id="rId13">
+        <w:t xml:space="preserve">Bolesa Egypt — backend team contribution | Production Platform: </w:t>
+      </w:r>
+      <w:hyperlink r:id="rId11">
         <w:r>
           <w:rPr>
             <w:b w:val="1"/>
             <w:bCs w:val="1"/>
-            <w:color w:val="6f7878"/>
+            <w:color w:val="1155cc"/>
             <w:sz w:val="18"/>
             <w:szCs w:val="18"/>
+            <w:u w:val="single"/>
             <w:rtl w:val="0"/>
           </w:rPr>
           <w:t xml:space="preserve">bolesa.net</w:t>
         </w:r>
       </w:hyperlink>
-    </w:p>
-    <w:p ns1:paraId="00000024">
+      <w:r>
+        <w:rPr>
+          <w:rtl w:val="0"/>
+        </w:rPr>
+      </w:r>
+    </w:p>
+    <w:p>
       <w:pPr>
         <w:tabs>
           <w:tab w:val="left" w:leader="none" w:pos="357"/>
@@ -1799,10 +1853,10 @@
           <w:szCs w:val="15"/>
           <w:rtl w:val="0"/>
         </w:rPr>
-        <w:t xml:space="preserve">• Built payment and billing backend flows that generate pending-order payment links, convert successful PaymentCaptured events into AWBs with issuing-fee ledger entries, and accrue reward points for MADA payments and approved bank transfers.</w:t>
-      </w:r>
-    </w:p>
-    <w:p ns1:paraId="00000025">
+        <w:t xml:space="preserve">• Built payment and billing backend flows that generate pending-order payment links, convert successful PaymentCaptured events into AWBs with</w:t>
+      </w:r>
+    </w:p>
+    <w:p>
       <w:pPr>
         <w:tabs>
           <w:tab w:val="left" w:leader="none" w:pos="357"/>
@@ -1822,10 +1876,10 @@
           <w:szCs w:val="15"/>
           <w:rtl w:val="0"/>
         </w:rPr>
-        <w:t xml:space="preserve">• Developed shipping AWB lifecycle automation with Horizon-queued carrier-status synchronization and automatic cancellation/refund-request handling when AWBs are deleted or cancelled.</w:t>
-      </w:r>
-    </w:p>
-    <w:p ns1:paraId="00000026">
+        <w:t xml:space="preserve">issuing-fee ledger entries, and accrue reward points for MADA payments and approved bank transfers.</w:t>
+      </w:r>
+    </w:p>
+    <w:p>
       <w:pPr>
         <w:tabs>
           <w:tab w:val="left" w:leader="none" w:pos="357"/>
@@ -1845,10 +1899,10 @@
           <w:szCs w:val="15"/>
           <w:rtl w:val="0"/>
         </w:rPr>
-        <w:t xml:space="preserve">• Extended the config-driven storageitsolutions/api-tables admin layer to support plan/carrier pricing management, payment-transaction observability, and shipping-AWB operational actions.</w:t>
-      </w:r>
-    </w:p>
-    <w:p ns1:paraId="00000027">
+        <w:t xml:space="preserve">• Developed shipping AWB lifecycle automation with Horizon-queued carrier-status synchronization and automatic cancellation/refund-request</w:t>
+      </w:r>
+    </w:p>
+    <w:p>
       <w:pPr>
         <w:tabs>
           <w:tab w:val="left" w:leader="none" w:pos="357"/>
@@ -1868,10 +1922,10 @@
           <w:szCs w:val="15"/>
           <w:rtl w:val="0"/>
         </w:rPr>
-        <w:t xml:space="preserve">• Delivered scheduled Excel operational reports for customer invoicing, monthly credits, and points conversion through SendCustomReportEmailJob on Horizon’s reports queue.</w:t>
-      </w:r>
-    </w:p>
-    <w:p ns1:paraId="00000028">
+        <w:t xml:space="preserve">handling when AWBs are deleted or cancelled.</w:t>
+      </w:r>
+    </w:p>
+    <w:p>
       <w:pPr>
         <w:tabs>
           <w:tab w:val="left" w:leader="none" w:pos="357"/>
@@ -1891,10 +1945,10 @@
           <w:szCs w:val="15"/>
           <w:rtl w:val="0"/>
         </w:rPr>
-        <w:t xml:space="preserve">• Improved production integrations by adding SPL National Address and HERE short-address lookup APIs with credit validation, and by hardening Salla, Salla-plugin, and Shopify order-ingestion against stuck unique-constraint failures.</w:t>
-      </w:r>
-    </w:p>
-    <w:p ns1:paraId="00000029">
+        <w:t xml:space="preserve">• Extended the config-driven storageitsolutions/api-tables admin layer to support plan/carrier pricing management, payment-transaction</w:t>
+      </w:r>
+    </w:p>
+    <w:p>
       <w:pPr>
         <w:tabs>
           <w:tab w:val="left" w:leader="none" w:pos="357"/>
@@ -1914,10 +1968,10 @@
           <w:szCs w:val="15"/>
           <w:rtl w:val="0"/>
         </w:rPr>
-        <w:t xml:space="preserve">• Implemented bank-account change and customer document workflows with supporting-document uploads, temp_bank_updates API-table handling, migrations, and customer/admin notifications.</w:t>
-      </w:r>
-    </w:p>
-    <w:p ns1:paraId="0000002B">
+        <w:t xml:space="preserve">observability, and shipping-AWB operational actions.</w:t>
+      </w:r>
+    </w:p>
+    <w:p>
       <w:pPr>
         <w:tabs>
           <w:tab w:val="left" w:leader="none" w:pos="357"/>
@@ -1932,11 +1986,149 @@
       </w:pPr>
       <w:r>
         <w:rPr>
-          <w:rtl w:val="0"/>
-        </w:rPr>
-      </w:r>
-    </w:p>
-    <w:p ns1:paraId="0000002C">
+          <w:color w:val="374246"/>
+          <w:sz w:val="15"/>
+          <w:szCs w:val="15"/>
+          <w:rtl w:val="0"/>
+        </w:rPr>
+        <w:t xml:space="preserve">• Delivered scheduled Excel operational reports for customer invoicing, monthly credits, and points conversion through SendCustomReportEmailJob</w:t>
+      </w:r>
+    </w:p>
+    <w:p>
+      <w:pPr>
+        <w:tabs>
+          <w:tab w:val="left" w:leader="none" w:pos="357"/>
+        </w:tabs>
+        <w:spacing w:before="35" w:line="360" w:lineRule="auto"/>
+        <w:ind w:right="921"/>
+        <w:rPr>
+          <w:color w:val="374246"/>
+          <w:sz w:val="15"/>
+          <w:szCs w:val="15"/>
+        </w:rPr>
+      </w:pPr>
+      <w:r>
+        <w:rPr>
+          <w:color w:val="374246"/>
+          <w:sz w:val="15"/>
+          <w:szCs w:val="15"/>
+          <w:rtl w:val="0"/>
+        </w:rPr>
+        <w:t xml:space="preserve">on Horizon’s reports queue.</w:t>
+      </w:r>
+    </w:p>
+    <w:p>
+      <w:pPr>
+        <w:tabs>
+          <w:tab w:val="left" w:leader="none" w:pos="357"/>
+        </w:tabs>
+        <w:spacing w:before="35" w:line="360" w:lineRule="auto"/>
+        <w:ind w:right="921"/>
+        <w:rPr>
+          <w:color w:val="374246"/>
+          <w:sz w:val="15"/>
+          <w:szCs w:val="15"/>
+        </w:rPr>
+      </w:pPr>
+      <w:r>
+        <w:rPr>
+          <w:color w:val="374246"/>
+          <w:sz w:val="15"/>
+          <w:szCs w:val="15"/>
+          <w:rtl w:val="0"/>
+        </w:rPr>
+        <w:t xml:space="preserve">• Improved production integrations by adding SPL National Address and HERE short-address lookup APIs with credit validation, and by hardening</w:t>
+      </w:r>
+    </w:p>
+    <w:p>
+      <w:pPr>
+        <w:tabs>
+          <w:tab w:val="left" w:leader="none" w:pos="357"/>
+        </w:tabs>
+        <w:spacing w:before="35" w:line="360" w:lineRule="auto"/>
+        <w:ind w:right="921"/>
+        <w:rPr>
+          <w:color w:val="374246"/>
+          <w:sz w:val="15"/>
+          <w:szCs w:val="15"/>
+        </w:rPr>
+      </w:pPr>
+      <w:r>
+        <w:rPr>
+          <w:color w:val="374246"/>
+          <w:sz w:val="15"/>
+          <w:szCs w:val="15"/>
+          <w:rtl w:val="0"/>
+        </w:rPr>
+        <w:t xml:space="preserve">Salla, Salla-plugin, and Shopify order-ingestion against stuck unique-constraint failures.</w:t>
+      </w:r>
+    </w:p>
+    <w:p>
+      <w:pPr>
+        <w:tabs>
+          <w:tab w:val="left" w:leader="none" w:pos="357"/>
+        </w:tabs>
+        <w:spacing w:before="35" w:line="360" w:lineRule="auto"/>
+        <w:ind w:right="921"/>
+        <w:rPr>
+          <w:color w:val="374246"/>
+          <w:sz w:val="15"/>
+          <w:szCs w:val="15"/>
+        </w:rPr>
+      </w:pPr>
+      <w:r>
+        <w:rPr>
+          <w:color w:val="374246"/>
+          <w:sz w:val="15"/>
+          <w:szCs w:val="15"/>
+          <w:rtl w:val="0"/>
+        </w:rPr>
+        <w:t xml:space="preserve">• Implemented bank-account change and customer document workflows with supporting-document uploads, temp_bank_updates API-table</w:t>
+      </w:r>
+    </w:p>
+    <w:p>
+      <w:pPr>
+        <w:tabs>
+          <w:tab w:val="left" w:leader="none" w:pos="357"/>
+        </w:tabs>
+        <w:spacing w:before="35" w:line="360" w:lineRule="auto"/>
+        <w:ind w:right="921"/>
+        <w:rPr>
+          <w:color w:val="374246"/>
+          <w:sz w:val="15"/>
+          <w:szCs w:val="15"/>
+        </w:rPr>
+      </w:pPr>
+      <w:r>
+        <w:rPr>
+          <w:color w:val="374246"/>
+          <w:sz w:val="15"/>
+          <w:szCs w:val="15"/>
+          <w:rtl w:val="0"/>
+        </w:rPr>
+        <w:t xml:space="preserve">handling, migrations, and customer/admin notifications.</w:t>
+      </w:r>
+    </w:p>
+    <w:p>
+      <w:pPr>
+        <w:tabs>
+          <w:tab w:val="left" w:leader="none" w:pos="357"/>
+        </w:tabs>
+        <w:spacing w:before="35" w:line="360" w:lineRule="auto"/>
+        <w:ind w:right="921"/>
+        <w:rPr>
+          <w:color w:val="374246"/>
+          <w:sz w:val="15"/>
+          <w:szCs w:val="15"/>
+        </w:rPr>
+      </w:pPr>
+      <w:r>
+        <w:rPr>
+          <w:rtl w:val="0"/>
+        </w:rPr>
+      </w:r>
+    </w:p>
+    <w:p>
       <w:pPr>
         <w:tabs>
           <w:tab w:val="left" w:leader="none" w:pos="9857"/>
@@ -1983,7 +2175,7 @@
         </w:rPr>
       </w:r>
     </w:p>
-    <w:p ns1:paraId="0000002D">
+    <w:p>
       <w:pPr>
         <w:tabs>
           <w:tab w:val="left" w:leader="none" w:pos="357"/>
@@ -2006,7 +2198,7 @@
         <w:t xml:space="preserve">• Built concurrent-safe slot reservation with expiry and role-separated authentication using Sanctum and OTP; used PostgreSQL/PostGIS for serviceable-area constraints and Laravel Octane/RoadRunner.</w:t>
       </w:r>
     </w:p>
-    <w:p ns1:paraId="0000002E">
+    <w:p>
       <w:pPr>
         <w:tabs>
           <w:tab w:val="left" w:leader="none" w:pos="9857"/>
@@ -2028,7 +2220,7 @@
         </w:rPr>
       </w:r>
     </w:p>
-    <w:p ns1:paraId="0000002F">
+    <w:p>
       <w:pPr>
         <w:tabs>
           <w:tab w:val="left" w:leader="none" w:pos="9857"/>
@@ -2050,7 +2242,7 @@
           <w:szCs w:val="20"/>
           <w:rtl w:val="0"/>
         </w:rPr>
-        <w:t xml:space="preserve">3Hand Design &amp; Marketing Solutions — Backend Engineer    </w:t>
+        <w:t xml:space="preserve">3Hand Design &amp; Marketing Solutions                                         </w:t>
       </w:r>
       <w:r>
         <w:rPr>
@@ -2068,7 +2260,7 @@
           <w:szCs w:val="17"/>
           <w:rtl w:val="0"/>
         </w:rPr>
-        <w:t xml:space="preserve">             Mar 2023</w:t>
+        <w:t xml:space="preserve">            Mar 2023</w:t>
       </w:r>
       <w:r>
         <w:rPr>
@@ -2085,7 +2277,7 @@
         </w:rPr>
       </w:r>
     </w:p>
-    <w:p ns1:paraId="00000030">
+    <w:p>
       <w:pPr>
         <w:tabs>
           <w:tab w:val="left" w:leader="none" w:pos="357"/>
@@ -2108,7 +2300,7 @@
         <w:t xml:space="preserve">  • Modeled financial-domain APIs for safes, banks, branches, and account statuses with validation-heavy business rules in the service layer.</w:t>
       </w:r>
     </w:p>
-    <w:p ns1:paraId="00000031">
+    <w:p>
       <w:pPr>
         <w:tabs>
           <w:tab w:val="left" w:leader="none" w:pos="357"/>
@@ -2136,7 +2328,7 @@
         </w:rPr>
       </w:r>
     </w:p>
-    <w:p ns1:paraId="00000032">
+    <w:p>
       <w:pPr>
         <w:tabs>
           <w:tab w:val="left" w:leader="none" w:pos="9857"/>
@@ -2156,7 +2348,7 @@
         </w:rPr>
       </w:r>
     </w:p>
-    <w:p ns1:paraId="00000033">
+    <w:p>
       <w:pPr>
         <w:tabs>
           <w:tab w:val="left" w:leader="none" w:pos="9857"/>
@@ -2178,7 +2370,7 @@
           <w:szCs w:val="20"/>
           <w:rtl w:val="0"/>
         </w:rPr>
-        <w:t xml:space="preserve">EPIK Software — Backend Engineer</w:t>
+        <w:t xml:space="preserve">EPIK Software                                    </w:t>
       </w:r>
       <w:r>
         <w:rPr>
@@ -2187,7 +2379,16 @@
           <w:szCs w:val="20"/>
           <w:rtl w:val="0"/>
         </w:rPr>
-        <w:t xml:space="preserve">                                                                                       </w:t>
+        <w:t xml:space="preserve">                                                                                      </w:t>
+      </w:r>
+      <w:r>
+        <w:rPr>
+          <w:color w:val="374246"/>
+          <w:sz w:val="17"/>
+          <w:szCs w:val="17"/>
+          <w:rtl w:val="0"/>
+        </w:rPr>
+        <w:t xml:space="preserve">              </w:t>
       </w:r>
       <w:r>
         <w:rPr>
@@ -2197,15 +2398,15 @@
           <w:vertAlign w:val="baseline"/>
           <w:rtl w:val="0"/>
         </w:rPr>
-        <w:t xml:space="preserve">Remotely | Oct 2023</w:t>
-      </w:r>
-      <w:r>
-        <w:rPr>
-          <w:rtl w:val="0"/>
-        </w:rPr>
-      </w:r>
-    </w:p>
-    <w:p ns1:paraId="00000034">
+        <w:t xml:space="preserve">Oct 2023</w:t>
+      </w:r>
+      <w:r>
+        <w:rPr>
+          <w:rtl w:val="0"/>
+        </w:rPr>
+      </w:r>
+    </w:p>
+    <w:p>
       <w:pPr>
         <w:keepNext w:val="0"/>
         <w:keepLines w:val="0"/>
@@ -2241,7 +2442,7 @@
         <w:t xml:space="preserve"> • Maintained authenticated REST APIs with RBAC authorization and MySQL schema/query optimization;participated in API contract design and code review for frontend integration.</w:t>
       </w:r>
     </w:p>
-    <w:p ns1:paraId="00000035">
+    <w:p>
       <w:pPr>
         <w:tabs>
           <w:tab w:val="left" w:leader="none" w:pos="9857"/>
@@ -2283,7 +2484,7 @@
         </w:rPr>
       </w:r>
     </w:p>
-    <w:p ns1:paraId="00000036">
+    <w:p>
       <w:pPr>
         <w:keepNext w:val="0"/>
         <w:keepLines w:val="0"/>
@@ -2337,7 +2538,7 @@
         </w:rPr>
         <w:t xml:space="preserve">Filament admin, RBAC, and Paymob subscriptions. </w:t>
       </w:r>
-      <w:hyperlink r:id="rId11">
+      <w:hyperlink r:id="rId12">
         <w:r>
           <w:rPr>
             <w:color w:val="1155cc"/>
@@ -2364,7 +2565,7 @@
         <w:t xml:space="preserve">           Sept 2024</w:t>
       </w:r>
     </w:p>
-    <w:p ns1:paraId="00000037">
+    <w:p>
       <w:pPr>
         <w:keepNext w:val="0"/>
         <w:keepLines w:val="0"/>
@@ -2453,7 +2654,7 @@
         </w:rPr>
       </w:r>
     </w:p>
-    <w:p ns1:paraId="00000038">
+    <w:p>
       <w:pPr>
         <w:pStyle w:val="Heading1"/>
         <w:tabs>
@@ -2490,42 +2691,42 @@
         </w:rPr>
       </w:r>
       <w:r>
-        <ns3:AlternateContent>
-          <ns3:Choice Requires="wps">
+        <mc:AlternateContent>
+          <mc:Choice Requires="wps">
             <w:drawing>
-              <ns4:anchor allowOverlap="1" behindDoc="0" distB="0" distT="0" distL="0" distR="0" hidden="0" layoutInCell="1" locked="0" relativeHeight="0" simplePos="0">
-                <ns4:simplePos x="0" y="0"/>
-                <ns4:positionH relativeFrom="column">
-                  <ns4:posOffset>66039</ns4:posOffset>
-                </ns4:positionH>
-                <ns4:positionV relativeFrom="paragraph">
-                  <ns4:posOffset>262890</ns4:posOffset>
-                </ns4:positionV>
-                <ns4:extent cx="8255" cy="12700"/>
-                <ns4:effectExtent b="0" l="0" r="0" t="0"/>
-                <ns4:wrapTopAndBottom distB="0" distT="0"/>
-                <ns4:docPr id="15" name=""/>
-                <ns5:graphic>
-                  <ns5:graphicData uri="http://schemas.microsoft.com/office/word/2010/wordprocessingShape">
-                    <ns6:wsp>
-                      <ns6:cNvSpPr/>
-                      <ns6:cNvPr id="3" name="Shape 3"/>
-                      <ns6:spPr>
-                        <ns5:xfrm>
-                          <ns5:off x="2018918" y="3775873"/>
-                          <ns5:ext cx="6654165" cy="8255"/>
-                        </ns5:xfrm>
-                        <ns5:prstGeom prst="rect">
-                          <ns5:avLst/>
-                        </ns5:prstGeom>
-                        <ns5:solidFill>
-                          <ns5:srgbClr val="000000"/>
-                        </ns5:solidFill>
-                        <ns5:ln>
-                          <ns5:noFill/>
-                        </ns5:ln>
-                      </ns6:spPr>
-                      <ns6:txbx>
+              <wp:anchor allowOverlap="1" behindDoc="0" distB="0" distT="0" distL="0" distR="0" hidden="0" layoutInCell="1" locked="0" relativeHeight="0" simplePos="0">
+                <wp:simplePos x="0" y="0"/>
+                <wp:positionH relativeFrom="column">
+                  <wp:posOffset>66039</wp:posOffset>
+                </wp:positionH>
+                <wp:positionV relativeFrom="paragraph">
+                  <wp:posOffset>262890</wp:posOffset>
+                </wp:positionV>
+                <wp:extent cx="8255" cy="12700"/>
+                <wp:effectExtent b="0" l="0" r="0" t="0"/>
+                <wp:wrapTopAndBottom distB="0" distT="0"/>
+                <wp:docPr id="15" name=""/>
+                <a:graphic>
+                  <a:graphicData uri="http://schemas.microsoft.com/office/word/2010/wordprocessingShape">
+                    <wps:wsp>
+                      <wps:cNvSpPr/>
+                      <wps:cNvPr id="3" name="Shape 3"/>
+                      <wps:spPr>
+                        <a:xfrm>
+                          <a:off x="2018918" y="3775873"/>
+                          <a:ext cx="6654165" cy="8255"/>
+                        </a:xfrm>
+                        <a:prstGeom prst="rect">
+                          <a:avLst/>
+                        </a:prstGeom>
+                        <a:solidFill>
+                          <a:srgbClr val="000000"/>
+                        </a:solidFill>
+                        <a:ln>
+                          <a:noFill/>
+                        </a:ln>
+                      </wps:spPr>
+                      <wps:txbx>
                         <w:txbxContent>
                           <w:p>
                             <w:pPr>
@@ -2536,62 +2737,62 @@
                             </w:pPr>
                           </w:p>
                         </w:txbxContent>
-                      </ns6:txbx>
-                      <ns6:bodyPr anchorCtr="0" anchor="ctr" bIns="91425" lIns="91425" spcFirstLastPara="1" rIns="91425" wrap="square" tIns="91425">
-                        <ns5:noAutofit/>
-                      </ns6:bodyPr>
-                    </ns6:wsp>
-                  </ns5:graphicData>
-                </ns5:graphic>
-              </ns4:anchor>
+                      </wps:txbx>
+                      <wps:bodyPr anchorCtr="0" anchor="ctr" bIns="91425" lIns="91425" spcFirstLastPara="1" rIns="91425" wrap="square" tIns="91425">
+                        <a:noAutofit/>
+                      </wps:bodyPr>
+                    </wps:wsp>
+                  </a:graphicData>
+                </a:graphic>
+              </wp:anchor>
             </w:drawing>
-          </ns3:Choice>
-          <ns3:Fallback>
+          </mc:Choice>
+          <mc:Fallback>
             <w:drawing>
-              <ns4:anchor allowOverlap="1" behindDoc="0" distB="0" distT="0" distL="0" distR="0" hidden="0" layoutInCell="1" locked="0" relativeHeight="0" simplePos="0">
-                <ns4:simplePos x="0" y="0"/>
-                <ns4:positionH relativeFrom="column">
-                  <ns4:posOffset>66039</ns4:posOffset>
-                </ns4:positionH>
-                <ns4:positionV relativeFrom="paragraph">
-                  <ns4:posOffset>262890</ns4:posOffset>
-                </ns4:positionV>
-                <ns4:extent cx="8255" cy="12700"/>
-                <ns4:effectExtent b="0" l="0" r="0" t="0"/>
-                <ns4:wrapTopAndBottom distB="0" distT="0"/>
-                <ns4:docPr id="15" name="image2.png"/>
-                <ns5:graphic>
-                  <ns5:graphicData uri="http://schemas.openxmlformats.org/drawingml/2006/picture">
-                    <ns7:pic>
-                      <ns7:nvPicPr>
-                        <ns7:cNvPr id="0" name="image2.png"/>
-                        <ns7:cNvPicPr preferRelativeResize="0"/>
-                      </ns7:nvPicPr>
-                      <ns7:blipFill>
-                        <ns5:blip r:embed="rId10"/>
-                        <ns5:srcRect/>
-                        <ns5:stretch>
-                          <ns5:fillRect/>
-                        </ns5:stretch>
-                      </ns7:blipFill>
-                      <ns7:spPr>
-                        <ns5:xfrm>
-                          <ns5:off x="0" y="0"/>
-                          <ns5:ext cx="8255" cy="12700"/>
-                        </ns5:xfrm>
-                        <ns5:prstGeom prst="rect"/>
-                        <ns5:ln/>
-                      </ns7:spPr>
-                    </ns7:pic>
-                  </ns5:graphicData>
-                </ns5:graphic>
-              </ns4:anchor>
+              <wp:anchor allowOverlap="1" behindDoc="0" distB="0" distT="0" distL="0" distR="0" hidden="0" layoutInCell="1" locked="0" relativeHeight="0" simplePos="0">
+                <wp:simplePos x="0" y="0"/>
+                <wp:positionH relativeFrom="column">
+                  <wp:posOffset>66039</wp:posOffset>
+                </wp:positionH>
+                <wp:positionV relativeFrom="paragraph">
+                  <wp:posOffset>262890</wp:posOffset>
+                </wp:positionV>
+                <wp:extent cx="8255" cy="12700"/>
+                <wp:effectExtent b="0" l="0" r="0" t="0"/>
+                <wp:wrapTopAndBottom distB="0" distT="0"/>
+                <wp:docPr id="15" name="image2.png"/>
+                <a:graphic>
+                  <a:graphicData uri="http://schemas.openxmlformats.org/drawingml/2006/picture">
+                    <pic:pic>
+                      <pic:nvPicPr>
+                        <pic:cNvPr id="0" name="image2.png"/>
+                        <pic:cNvPicPr preferRelativeResize="0"/>
+                      </pic:nvPicPr>
+                      <pic:blipFill>
+                        <a:blip r:embed="rId10"/>
+                        <a:srcRect/>
+                        <a:stretch>
+                          <a:fillRect/>
+                        </a:stretch>
+                      </pic:blipFill>
+                      <pic:spPr>
+                        <a:xfrm>
+                          <a:off x="0" y="0"/>
+                          <a:ext cx="8255" cy="12700"/>
+                        </a:xfrm>
+                        <a:prstGeom prst="rect"/>
+                        <a:ln/>
+                      </pic:spPr>
+                    </pic:pic>
+                  </a:graphicData>
+                </a:graphic>
+              </wp:anchor>
             </w:drawing>
-          </ns3:Fallback>
-        </ns3:AlternateContent>
-      </w:r>
-    </w:p>
-    <w:p ns1:paraId="00000039">
+          </mc:Fallback>
+        </mc:AlternateContent>
+      </w:r>
+    </w:p>
+    <w:p>
       <w:pPr>
         <w:tabs>
           <w:tab w:val="left" w:leader="none" w:pos="8899"/>
@@ -2601,6 +2802,8 @@
         <w:jc w:val="center"/>
         <w:rPr>
           <w:color w:val="000000"/>
+          <w:sz w:val="20"/>
+          <w:szCs w:val="20"/>
         </w:rPr>
       </w:pPr>
       <w:r>
@@ -2610,26 +2813,26 @@
           <w:szCs w:val="20"/>
           <w:rtl w:val="0"/>
         </w:rPr>
-        <w:t xml:space="preserve">Bachelor’s Degree, Computer Engineering — EL-Shorouk Academy</w:t>
+        <w:t xml:space="preserve">Bachelor's degree, Computer Engineering</w:t>
         <w:tab/>
       </w:r>
       <w:r>
         <w:rPr>
           <w:color w:val="374246"/>
-          <w:sz w:val="17"/>
-          <w:szCs w:val="17"/>
+          <w:sz w:val="15"/>
+          <w:szCs w:val="15"/>
           <w:vertAlign w:val="baseline"/>
           <w:rtl w:val="0"/>
         </w:rPr>
-        <w:t xml:space="preserve"/>
-      </w:r>
-      <w:r>
-        <w:rPr>
-          <w:rtl w:val="0"/>
-        </w:rPr>
-      </w:r>
-    </w:p>
-    <w:p ns1:paraId="0000003A">
+        <w:t xml:space="preserve">EL-Shorouk Academy</w:t>
+      </w:r>
+      <w:r>
+        <w:rPr>
+          <w:rtl w:val="0"/>
+        </w:rPr>
+      </w:r>
+    </w:p>
+    <w:p>
       <w:pPr>
         <w:pStyle w:val="Heading2"/>
         <w:tabs>
@@ -2638,14 +2841,20 @@
         <w:spacing w:before="29" w:line="360" w:lineRule="auto"/>
         <w:ind w:right="11"/>
         <w:jc w:val="center"/>
-        <w:rPr/>
-      </w:pPr>
-      <w:r>
-        <w:rPr>
-          <w:color w:val="000000"/>
-          <w:rtl w:val="0"/>
-        </w:rPr>
-        <w:t xml:space="preserve">Grade: Good | 2019–2023</w:t>
+        <w:rPr>
+          <w:sz w:val="18"/>
+          <w:szCs w:val="18"/>
+        </w:rPr>
+      </w:pPr>
+      <w:r>
+        <w:rPr>
+          <w:rFonts w:ascii="Tahoma" w:cs="Tahoma" w:eastAsia="Tahoma" w:hAnsi="Tahoma"/>
+          <w:color w:val="6f7878"/>
+          <w:sz w:val="18"/>
+          <w:szCs w:val="18"/>
+          <w:rtl w:val="0"/>
+        </w:rPr>
+        <w:t xml:space="preserve">Grade: Good</w:t>
       </w:r>
       <w:r>
         <w:rPr>
@@ -2657,17 +2866,19 @@
       <w:r>
         <w:rPr>
           <w:color w:val="374246"/>
-          <w:rtl w:val="0"/>
-        </w:rPr>
-        <w:t xml:space="preserve"/>
-      </w:r>
-      <w:r>
-        <w:rPr>
-          <w:rtl w:val="0"/>
-        </w:rPr>
-      </w:r>
-    </w:p>
-    <w:p ns1:paraId="0000003B">
+          <w:sz w:val="18"/>
+          <w:szCs w:val="18"/>
+          <w:rtl w:val="0"/>
+        </w:rPr>
+        <w:t xml:space="preserve">2019 - 2023</w:t>
+      </w:r>
+      <w:r>
+        <w:rPr>
+          <w:rtl w:val="0"/>
+        </w:rPr>
+      </w:r>
+    </w:p>
+    <w:p>
       <w:pPr>
         <w:keepNext w:val="0"/>
         <w:keepLines w:val="0"/>
@@ -2724,15 +2935,15 @@
           <w:vertAlign w:val="baseline"/>
           <w:rtl w:val="0"/>
         </w:rPr>
-        <w:t xml:space="preserve">Relevant coursework: Data Structures, Object-Oriented Programming, Algorithm Analysis, Software Engineering, Operating Systems, Computer Architecture, Compiler Theory, Artificial Intelligence.</w:t>
-      </w:r>
-      <w:r>
-        <w:rPr>
-          <w:rtl w:val="0"/>
-        </w:rPr>
-      </w:r>
-    </w:p>
-    <w:p ns1:paraId="0000003C">
+        <w:t xml:space="preserve">Relevant coursework: Data Structures, Object-Oriented Programming, Algorithms Analysis, Software Engineering, Operating Systems, Computer Architecture, Compiler Theory, Artiﬁcial Intelligence.</w:t>
+      </w:r>
+      <w:r>
+        <w:rPr>
+          <w:rtl w:val="0"/>
+        </w:rPr>
+      </w:r>
+    </w:p>
+    <w:p>
       <w:pPr>
         <w:pStyle w:val="Heading1"/>
         <w:tabs>
@@ -2763,42 +2974,42 @@
         <w:t xml:space="preserve">Training / Courses</w:t>
       </w:r>
       <w:r>
-        <ns3:AlternateContent>
-          <ns3:Choice Requires="wps">
+        <mc:AlternateContent>
+          <mc:Choice Requires="wps">
             <w:drawing>
-              <ns4:anchor allowOverlap="1" behindDoc="0" distB="0" distT="0" distL="0" distR="0" hidden="0" layoutInCell="1" locked="0" relativeHeight="0" simplePos="0">
-                <ns4:simplePos x="0" y="0"/>
-                <ns4:positionH relativeFrom="column">
-                  <ns4:posOffset>66039</ns4:posOffset>
-                </ns4:positionH>
-                <ns4:positionV relativeFrom="paragraph">
-                  <ns4:posOffset>262890</ns4:posOffset>
-                </ns4:positionV>
-                <ns4:extent cx="8255" cy="12700"/>
-                <ns4:effectExtent b="0" l="0" r="0" t="0"/>
-                <ns4:wrapTopAndBottom distB="0" distT="0"/>
-                <ns4:docPr id="16" name=""/>
-                <ns5:graphic>
-                  <ns5:graphicData uri="http://schemas.microsoft.com/office/word/2010/wordprocessingShape">
-                    <ns6:wsp>
-                      <ns6:cNvSpPr/>
-                      <ns6:cNvPr id="4" name="Shape 4"/>
-                      <ns6:spPr>
-                        <ns5:xfrm>
-                          <ns5:off x="2018918" y="3775873"/>
-                          <ns5:ext cx="6654165" cy="8255"/>
-                        </ns5:xfrm>
-                        <ns5:prstGeom prst="rect">
-                          <ns5:avLst/>
-                        </ns5:prstGeom>
-                        <ns5:solidFill>
-                          <ns5:srgbClr val="000000"/>
-                        </ns5:solidFill>
-                        <ns5:ln>
-                          <ns5:noFill/>
-                        </ns5:ln>
-                      </ns6:spPr>
-                      <ns6:txbx>
+              <wp:anchor allowOverlap="1" behindDoc="0" distB="0" distT="0" distL="0" distR="0" hidden="0" layoutInCell="1" locked="0" relativeHeight="0" simplePos="0">
+                <wp:simplePos x="0" y="0"/>
+                <wp:positionH relativeFrom="column">
+                  <wp:posOffset>66039</wp:posOffset>
+                </wp:positionH>
+                <wp:positionV relativeFrom="paragraph">
+                  <wp:posOffset>262890</wp:posOffset>
+                </wp:positionV>
+                <wp:extent cx="8255" cy="12700"/>
+                <wp:effectExtent b="0" l="0" r="0" t="0"/>
+                <wp:wrapTopAndBottom distB="0" distT="0"/>
+                <wp:docPr id="16" name=""/>
+                <a:graphic>
+                  <a:graphicData uri="http://schemas.microsoft.com/office/word/2010/wordprocessingShape">
+                    <wps:wsp>
+                      <wps:cNvSpPr/>
+                      <wps:cNvPr id="4" name="Shape 4"/>
+                      <wps:spPr>
+                        <a:xfrm>
+                          <a:off x="2018918" y="3775873"/>
+                          <a:ext cx="6654165" cy="8255"/>
+                        </a:xfrm>
+                        <a:prstGeom prst="rect">
+                          <a:avLst/>
+                        </a:prstGeom>
+                        <a:solidFill>
+                          <a:srgbClr val="000000"/>
+                        </a:solidFill>
+                        <a:ln>
+                          <a:noFill/>
+                        </a:ln>
+                      </wps:spPr>
+                      <wps:txbx>
                         <w:txbxContent>
                           <w:p>
                             <w:pPr>
@@ -2809,62 +3020,62 @@
                             </w:pPr>
                           </w:p>
                         </w:txbxContent>
-                      </ns6:txbx>
-                      <ns6:bodyPr anchorCtr="0" anchor="ctr" bIns="91425" lIns="91425" spcFirstLastPara="1" rIns="91425" wrap="square" tIns="91425">
-                        <ns5:noAutofit/>
-                      </ns6:bodyPr>
-                    </ns6:wsp>
-                  </ns5:graphicData>
-                </ns5:graphic>
-              </ns4:anchor>
+                      </wps:txbx>
+                      <wps:bodyPr anchorCtr="0" anchor="ctr" bIns="91425" lIns="91425" spcFirstLastPara="1" rIns="91425" wrap="square" tIns="91425">
+                        <a:noAutofit/>
+                      </wps:bodyPr>
+                    </wps:wsp>
+                  </a:graphicData>
+                </a:graphic>
+              </wp:anchor>
             </w:drawing>
-          </ns3:Choice>
-          <ns3:Fallback>
+          </mc:Choice>
+          <mc:Fallback>
             <w:drawing>
-              <ns4:anchor allowOverlap="1" behindDoc="0" distB="0" distT="0" distL="0" distR="0" hidden="0" layoutInCell="1" locked="0" relativeHeight="0" simplePos="0">
-                <ns4:simplePos x="0" y="0"/>
-                <ns4:positionH relativeFrom="column">
-                  <ns4:posOffset>66039</ns4:posOffset>
-                </ns4:positionH>
-                <ns4:positionV relativeFrom="paragraph">
-                  <ns4:posOffset>262890</ns4:posOffset>
-                </ns4:positionV>
-                <ns4:extent cx="8255" cy="12700"/>
-                <ns4:effectExtent b="0" l="0" r="0" t="0"/>
-                <ns4:wrapTopAndBottom distB="0" distT="0"/>
-                <ns4:docPr id="16" name="image3.png"/>
-                <ns5:graphic>
-                  <ns5:graphicData uri="http://schemas.openxmlformats.org/drawingml/2006/picture">
-                    <ns7:pic>
-                      <ns7:nvPicPr>
-                        <ns7:cNvPr id="0" name="image3.png"/>
-                        <ns7:cNvPicPr preferRelativeResize="0"/>
-                      </ns7:nvPicPr>
-                      <ns7:blipFill>
-                        <ns5:blip r:embed="rId10"/>
-                        <ns5:srcRect/>
-                        <ns5:stretch>
-                          <ns5:fillRect/>
-                        </ns5:stretch>
-                      </ns7:blipFill>
-                      <ns7:spPr>
-                        <ns5:xfrm>
-                          <ns5:off x="0" y="0"/>
-                          <ns5:ext cx="8255" cy="12700"/>
-                        </ns5:xfrm>
-                        <ns5:prstGeom prst="rect"/>
-                        <ns5:ln/>
-                      </ns7:spPr>
-                    </ns7:pic>
-                  </ns5:graphicData>
-                </ns5:graphic>
-              </ns4:anchor>
+              <wp:anchor allowOverlap="1" behindDoc="0" distB="0" distT="0" distL="0" distR="0" hidden="0" layoutInCell="1" locked="0" relativeHeight="0" simplePos="0">
+                <wp:simplePos x="0" y="0"/>
+                <wp:positionH relativeFrom="column">
+                  <wp:posOffset>66039</wp:posOffset>
+                </wp:positionH>
+                <wp:positionV relativeFrom="paragraph">
+                  <wp:posOffset>262890</wp:posOffset>
+                </wp:positionV>
+                <wp:extent cx="8255" cy="12700"/>
+                <wp:effectExtent b="0" l="0" r="0" t="0"/>
+                <wp:wrapTopAndBottom distB="0" distT="0"/>
+                <wp:docPr id="16" name="image3.png"/>
+                <a:graphic>
+                  <a:graphicData uri="http://schemas.openxmlformats.org/drawingml/2006/picture">
+                    <pic:pic>
+                      <pic:nvPicPr>
+                        <pic:cNvPr id="0" name="image3.png"/>
+                        <pic:cNvPicPr preferRelativeResize="0"/>
+                      </pic:nvPicPr>
+                      <pic:blipFill>
+                        <a:blip r:embed="rId10"/>
+                        <a:srcRect/>
+                        <a:stretch>
+                          <a:fillRect/>
+                        </a:stretch>
+                      </pic:blipFill>
+                      <pic:spPr>
+                        <a:xfrm>
+                          <a:off x="0" y="0"/>
+                          <a:ext cx="8255" cy="12700"/>
+                        </a:xfrm>
+                        <a:prstGeom prst="rect"/>
+                        <a:ln/>
+                      </pic:spPr>
+                    </pic:pic>
+                  </a:graphicData>
+                </a:graphic>
+              </wp:anchor>
             </w:drawing>
-          </ns3:Fallback>
-        </ns3:AlternateContent>
-      </w:r>
-    </w:p>
-    <w:p ns1:paraId="0000003D">
+          </mc:Fallback>
+        </mc:AlternateContent>
+      </w:r>
+    </w:p>
+    <w:p>
       <w:pPr>
         <w:pStyle w:val="Heading1"/>
         <w:numPr>
@@ -2894,7 +3105,7 @@
           <w:szCs w:val="16"/>
           <w:rtl w:val="0"/>
         </w:rPr>
-        <w:t xml:space="preserve"> Embedded Systems — Information Technology Institute (ITI) · Back-End Development — Itrax Academy</w:t>
+        <w:t xml:space="preserve">Embedded System ___ Information Technology Institute (ITI)                        -     Back-End Development ___ Itrax Academy</w:t>
       </w:r>
       <w:r>
         <w:rPr>
@@ -2903,7 +3114,7 @@
       </w:r>
     </w:p>
     <w:sectPr>
-      <w:footerReference r:id="rId12" w:type="default"/>
+      <w:footerReference r:id="rId13" w:type="default"/>
       <w:pgSz w:h="16834" w:w="11909" w:orient="portrait"/>
       <w:pgMar w:bottom="1296" w:top="576" w:left="619" w:right="605" w:header="0" w:footer="1109"/>
       <w:pgNumType w:start="1"/>

</xml_diff>

<commit_message>
Update CV documents with latest revisions in Word and PDF formats.
</commit_message>
<xml_diff>
--- a/Maher Mostafa Cv.docx
+++ b/Maher Mostafa Cv.docx
@@ -446,22 +446,13 @@
       <w:hyperlink r:id="rId9">
         <w:r>
           <w:rPr>
-            <w:rFonts w:ascii="Tahoma" w:cs="Tahoma" w:eastAsia="Tahoma" w:hAnsi="Tahoma"/>
-            <w:b w:val="0"/>
-            <w:bCs w:val="0"/>
-            <w:i w:val="0"/>
-            <w:iCs w:val="0"/>
-            <w:smallCaps w:val="0"/>
-            <w:strike w:val="0"/>
             <w:color w:val="1155cc"/>
             <w:sz w:val="15"/>
             <w:szCs w:val="15"/>
             <w:u w:val="single"/>
-            <w:shd w:fill="auto" w:val="clear"/>
-            <w:vertAlign w:val="baseline"/>
             <w:rtl w:val="0"/>
           </w:rPr>
-          <w:t xml:space="preserve">github.com/MaherElshimy</w:t>
+          <w:t xml:space="preserve">GitHub</w:t>
         </w:r>
       </w:hyperlink>
       <w:r>
@@ -859,7 +850,7 @@
       </w:pPr>
       <w:sdt>
         <w:sdtPr>
-          <w:id w:val="2056158543"/>
+          <w:id w:val="-1266877917"/>
           <w:tag w:val="goog_rdk_0"/>
         </w:sdtPr>
         <w:sdtContent>
@@ -905,7 +896,7 @@
       </w:pPr>
       <w:sdt>
         <w:sdtPr>
-          <w:id w:val="-1435145029"/>
+          <w:id w:val="889170496"/>
           <w:tag w:val="goog_rdk_1"/>
         </w:sdtPr>
         <w:sdtContent>
@@ -959,7 +950,7 @@
       </w:pPr>
       <w:sdt>
         <w:sdtPr>
-          <w:id w:val="-2001240111"/>
+          <w:id w:val="2142494234"/>
           <w:tag w:val="goog_rdk_2"/>
         </w:sdtPr>
         <w:sdtContent>
@@ -1005,7 +996,7 @@
       </w:pPr>
       <w:sdt>
         <w:sdtPr>
-          <w:id w:val="76381596"/>
+          <w:id w:val="-308801394"/>
           <w:tag w:val="goog_rdk_3"/>
         </w:sdtPr>
         <w:sdtContent>
@@ -1037,6 +1028,52 @@
           <w:rtl w:val="0"/>
         </w:rPr>
         <w:t xml:space="preserve">Wallet ledgers, payment gateway abstraction, webhook idempotency, transaction rollback, API-key authentication, bcrypt key rotation, HMAC verification, rate limiting</w:t>
+      </w:r>
+    </w:p>
+    <w:p>
+      <w:pPr>
+        <w:spacing w:before="10" w:line="360" w:lineRule="auto"/>
+        <w:ind w:left="103" w:firstLine="0"/>
+        <w:jc w:val="both"/>
+        <w:rPr>
+          <w:sz w:val="15"/>
+          <w:szCs w:val="15"/>
+        </w:rPr>
+      </w:pPr>
+      <w:sdt>
+        <w:sdtPr>
+          <w:id w:val="-727096909"/>
+          <w:tag w:val="goog_rdk_4"/>
+        </w:sdtPr>
+        <w:sdtContent>
+          <w:r>
+            <w:rPr>
+              <w:rFonts w:ascii="Arial Unicode MS" w:cs="Arial Unicode MS" w:eastAsia="Arial Unicode MS" w:hAnsi="Arial Unicode MS"/>
+              <w:sz w:val="15"/>
+              <w:szCs w:val="15"/>
+              <w:rtl w:val="0"/>
+            </w:rPr>
+            <w:t xml:space="preserve">● </w:t>
+          </w:r>
+        </w:sdtContent>
+      </w:sdt>
+      <w:r>
+        <w:rPr>
+          <w:b w:val="1"/>
+          <w:bCs w:val="1"/>
+          <w:sz w:val="15"/>
+          <w:szCs w:val="15"/>
+          <w:rtl w:val="0"/>
+        </w:rPr>
+        <w:t xml:space="preserve">Cloud &amp; DevOps: </w:t>
+      </w:r>
+      <w:r>
+        <w:rPr>
+          <w:sz w:val="15"/>
+          <w:szCs w:val="15"/>
+          <w:rtl w:val="0"/>
+        </w:rPr>
+        <w:t xml:space="preserve">Docker, GitHub ActionS</w:t>
       </w:r>
       <w:r>
         <w:rPr>
@@ -1331,7 +1368,7 @@
           <w:szCs w:val="20"/>
           <w:rtl w:val="0"/>
         </w:rPr>
-        <w:t xml:space="preserve">                                 </w:t>
+        <w:t xml:space="preserve">                               </w:t>
       </w:r>
       <w:r>
         <w:rPr>
@@ -1340,7 +1377,7 @@
           <w:szCs w:val="17"/>
           <w:rtl w:val="0"/>
         </w:rPr>
-        <w:t xml:space="preserve">                 Jan 2026</w:t>
+        <w:t xml:space="preserve">Storage Station   Jan 2026</w:t>
       </w:r>
       <w:r>
         <w:rPr>
@@ -1499,7 +1536,7 @@
           <w:szCs w:val="20"/>
           <w:rtl w:val="0"/>
         </w:rPr>
-        <w:t xml:space="preserve">                                               </w:t>
+        <w:t xml:space="preserve">                                      </w:t>
       </w:r>
       <w:r>
         <w:rPr>
@@ -1508,7 +1545,7 @@
           <w:szCs w:val="17"/>
           <w:rtl w:val="0"/>
         </w:rPr>
-        <w:t xml:space="preserve">                   Jun 2026</w:t>
+        <w:t xml:space="preserve">        Storage Station   Jun 2026</w:t>
       </w:r>
       <w:r>
         <w:rPr>
@@ -1531,8 +1568,8 @@
       </w:pPr>
       <w:sdt>
         <w:sdtPr>
-          <w:id w:val="-417610829"/>
-          <w:tag w:val="goog_rdk_4"/>
+          <w:id w:val="1523908736"/>
+          <w:tag w:val="goog_rdk_5"/>
         </w:sdtPr>
         <w:sdtContent>
           <w:r>
@@ -1632,8 +1669,8 @@
       </w:pPr>
       <w:sdt>
         <w:sdtPr>
-          <w:id w:val="-2039388166"/>
-          <w:tag w:val="goog_rdk_5"/>
+          <w:id w:val="497687005"/>
+          <w:tag w:val="goog_rdk_6"/>
         </w:sdtPr>
         <w:sdtContent>
           <w:r>
@@ -1684,7 +1721,27 @@
           <w:szCs w:val="20"/>
           <w:rtl w:val="0"/>
         </w:rPr>
-        <w:t xml:space="preserve">                                      </w:t>
+        <w:t xml:space="preserve">                   </w:t>
+      </w:r>
+      <w:r>
+        <w:rPr>
+          <w:color w:val="374246"/>
+          <w:sz w:val="17"/>
+          <w:szCs w:val="17"/>
+          <w:rtl w:val="0"/>
+        </w:rPr>
+        <w:t xml:space="preserve">Storage Station   </w:t>
+      </w:r>
+      <w:r>
+        <w:rPr>
+          <w:b w:val="1"/>
+          <w:bCs w:val="1"/>
+          <w:color w:val="6f7878"/>
+          <w:sz w:val="20"/>
+          <w:szCs w:val="20"/>
+          <w:rtl w:val="0"/>
+        </w:rPr>
+        <w:t xml:space="preserve"> </w:t>
       </w:r>
       <w:r>
         <w:rPr>
@@ -1829,6 +1886,24 @@
       </w:hyperlink>
       <w:r>
         <w:rPr>
+          <w:color w:val="374246"/>
+          <w:sz w:val="15"/>
+          <w:szCs w:val="15"/>
+          <w:rtl w:val="0"/>
+        </w:rPr>
+        <w:t xml:space="preserve">                                  </w:t>
+      </w:r>
+      <w:r>
+        <w:rPr>
+          <w:color w:val="374246"/>
+          <w:sz w:val="17"/>
+          <w:szCs w:val="17"/>
+          <w:rtl w:val="0"/>
+        </w:rPr>
+        <w:t xml:space="preserve">Storage Station   </w:t>
+      </w:r>
+      <w:r>
+        <w:rPr>
           <w:rtl w:val="0"/>
         </w:rPr>
       </w:r>
@@ -2149,7 +2224,7 @@
           <w:szCs w:val="20"/>
           <w:rtl w:val="0"/>
         </w:rPr>
-        <w:t xml:space="preserve">CareQ — salon booking platform                                                                                                </w:t>
+        <w:t xml:space="preserve">CareQ — salon booking platform                                                                                          </w:t>
       </w:r>
       <w:r>
         <w:rPr>
@@ -2158,7 +2233,27 @@
           <w:szCs w:val="17"/>
           <w:rtl w:val="0"/>
         </w:rPr>
-        <w:t xml:space="preserve">               May 2025</w:t>
+        <w:t xml:space="preserve">Storage Station   </w:t>
+      </w:r>
+      <w:r>
+        <w:rPr>
+          <w:b w:val="1"/>
+          <w:bCs w:val="1"/>
+          <w:color w:val="6f7878"/>
+          <w:sz w:val="20"/>
+          <w:szCs w:val="20"/>
+          <w:rtl w:val="0"/>
+        </w:rPr>
+        <w:t xml:space="preserve"> </w:t>
+      </w:r>
+      <w:r>
+        <w:rPr>
+          <w:color w:val="374246"/>
+          <w:sz w:val="17"/>
+          <w:szCs w:val="17"/>
+          <w:rtl w:val="0"/>
+        </w:rPr>
+        <w:t xml:space="preserve">May 2025</w:t>
       </w:r>
       <w:r>
         <w:rPr>
@@ -2527,7 +2622,7 @@
           <w:szCs w:val="15"/>
           <w:rtl w:val="0"/>
         </w:rPr>
-        <w:t xml:space="preserve">Goods Platform (3Hand):  </w:t>
+        <w:t xml:space="preserve">Goods Platform— 3Hand:  </w:t>
       </w:r>
       <w:r>
         <w:rPr>
@@ -2628,7 +2723,7 @@
           <w:szCs w:val="15"/>
           <w:rtl w:val="0"/>
         </w:rPr>
-        <w:t xml:space="preserve">(EPIK):</w:t>
+        <w:t xml:space="preserve">— EPIK:</w:t>
       </w:r>
       <w:r>
         <w:rPr>
@@ -4014,7 +4109,7 @@
 
 <file path=customXML/item1.xml><?xml version="1.0" encoding="utf-8"?>
 <go:gDocsCustomXmlDataStorage xmlns:go="http://customooxmlschemas.google.com/" xmlns:r="http://schemas.openxmlformats.org/officeDocument/2006/relationships" uri="GoogleDocsCustomDataVersion2">
-  <go:docsCustomData xmlns:go="http://customooxmlschemas.google.com/" roundtripDataSignature="AMtx7mg9b86fE7xsV44x0ooxlECFTxntpg==">CgMxLjAaHQoBMBIYChYIB0ISEhBBcmlhbCBVbmljb2RlIE1TGh0KATESGAoWCAdCEhIQQXJpYWwgVW5pY29kZSBNUxodCgEyEhgKFggHQhISEEFyaWFsIFVuaWNvZGUgTVMaHQoBMxIYChYIB0ISEhBBcmlhbCBVbmljb2RlIE1TGh0KATQSGAoWCAdCEhIQQXJpYWwgVW5pY29kZSBNUxodCgE1EhgKFggHQhISEEFyaWFsIFVuaWNvZGUgTVMimwIKC0FBQUJydHlGQ2tnEuYBCgtBQUFCcnR5RkNrZxILQUFBQnJ0eUZDa2caDQoJdGV4dC9odG1sEgAiDgoKdGV4dC9wbGFpbhIAKhsiFTExNzA1Mzg0ODUyNTQ1NzM0MTcxMSgAOAAwnuLprJozONLm6ayaM0pECiRhcHBsaWNhdGlvbi92bmQuZ29vZ2xlLWFwcHMuZG9jcy5tZHMaHMLX2uQBFgoUCgcKAT0QARgAEgcKAS4QARgAGAFaDG80enF2c3lmOWhxN3ICIAB4AIIBE3N1Z2dlc3QudzN1dGxycTllazSaAQYIABAAGACwAQC4AQDIAQAYnuLprJozINLm6ayaMzAAQhNzdWdnZXN0LnczdXRscnE5ZWs0IpMCCgtBQUFCcnR5RkNrRRLdAQoLQUFBQnJ0eUZDa0USC0FBQUJydHlGQ2tFGg0KCXRleHQvaHRtbBIAIg4KCnRleHQvcGxhaW4SACobIhUxMTcwNTM4NDg1MjU0NTczNDE3MTEoADgAMJTN5qyaMzjJ0uasmjNKOgokYXBwbGljYXRpb24vdm5kLmdvb2dsZS1hcHBzLmRvY3MubWRzGhLC19rkAQwaCgoGCgAQFBgAEAFaDG9xeDY2OTFrdGdvN3ICIAB4AIIBFHN1Z2dlc3QuZG82eDVzdnNhMTJ5mgEGCAAQABgAsAEAuAEAyAEAGJTN5qyaMyDJ0uasmjMwAEIUc3VnZ2VzdC5kbzZ4NXN2c2ExMnkiowIKC0FBQUJydHlGQ2tNEu0BCgtBQUFCcnR5RkNrTRILQUFBQnJ0eUZDa00aDQoJdGV4dC9odG1sEgAiDgoKdGV4dC9wbGFpbhIAKhsiFTExNzA1Mzg0ODUyNTQ1NzM0MTcxMSgAOAAw3qfnrJozOI+s56yaM0pKCiRhcHBsaWNhdGlvbi92bmQuZ29vZ2xlLWFwcHMuZG9jcy5tZHMaIsLX2uQBHBIaChYKEEdvb2RzIFZpc2l0IFNpdGUQARgAEAFaDHpicXp5ZXMxYXRrb3ICIAB4AIIBFHN1Z2dlc3QuZHQycnZzb2I5Z2N4mgEGCAAQABgAsAEAuAEAyAEAGN6n56yaMyCPrOesmjMwAEIUc3VnZ2VzdC5kdDJydnNvYjlnY3gikQIKC0FBQUJydHlGQ2tJEtwBCgtBQUFCcnR5RkNrSRILQUFBQnJ0eUZDa0kaDQoJdGV4dC9odG1sEgAiDgoKdGV4dC9wbGFpbhIAKhsiFTExNzA1Mzg0ODUyNTQ1NzM0MTcxMSgAOAAwwOvmrJozOPjw5qyaM0o6CiRhcHBsaWNhdGlvbi92bmQuZ29vZ2xlLWFwcHMuZG9jcy5tZHMaEsLX2uQBDBoKCgYKABATGAAQAVoMbmcwZ3JwdXhndGtzcgIgAHgAggETc3VnZ2VzdC55eTRnNzJhN2Rla5oBBggAEAAYALABALgBAMgBABjA6+asmjMg+PDmrJozMABCE3N1Z2dlc3QueXk0ZzcyYTdkZWsinwIKC0FBQUJydHlGQ2pnEukBCgtBQUFCcnR5RkNqZxILQUFBQnJ0eUZDamcaDQoJdGV4dC9odG1sEgAiDgoKdGV4dC9wbGFpbhIAKhsiFTExNzA1Mzg0ODUyNTQ1NzM0MTcxMSgAOAAws6vfrJozOMC636yaM0pHCiRhcHBsaWNhdGlvbi92bmQuZ29vZ2xlLWFwcHMuZG9jcy5tZHMaH8LX2uQBGRoKCgYKABAUGAAQAxoLCgcKAS0QARgAEAFaCzVnYjdsc202OHZxcgIgAHgAggEUc3VnZ2VzdC4zc3E0cXVmaW5jZ2OaAQYIABAAGACwAQC4AQDIAQAYs6vfrJozIMC636yaMzAAQhRzdWdnZXN0LjNzcTRxdWZpbmNnYyKkAgoLQUFBQnJrazhVeWMS7gEKC0FBQUJya2s4VXljEgtBQUFCcmtrOFV5YxoNCgl0ZXh0L2h0bWwSACIOCgp0ZXh0L3BsYWluEgAqGyIVMTE3MDUzODQ4NTI1NDU3MzQxNzExKAA4ADDz6v7amDM4noz/2pgzSksKJGFwcGxpY2F0aW9uL3ZuZC5nb29nbGUtYXBwcy5kb2NzLm1kcxojwtfa5AEdGhsKFwoRaHR0cHM6Ly9nb29kcy5lZy8QCBgAEAFaDGp3dzJ4ZmlpdTJncnICIAB4AIIBFHN1Z2dlc3QucHBjOHkxMXFhcDFmmgEGCAAQABgAsAEAuAEAyAEAGPPq/tqYMyCejP/amDMwAEIUc3VnZ2VzdC5wcGM4eTExcWFwMWYisAIKC0FBQUJydHlGQ2tVEvoBCgtBQUFCcnR5RkNrVRILQUFBQnJ0eUZDa1UaDQoJdGV4dC9odG1sEgAiDgoKdGV4dC9wbGFpbhIAKhsiFTExNzA1Mzg0ODUyNTQ1NzM0MTcxMSgAOAAwhMDorJozOO7E6KyaM0pXCiRhcHBsaWNhdGlvbi92bmQuZ29vZ2xlLWFwcHMuZG9jcy5tZHMaL8LX2uQBKRInCiMKHeKXjyBXZWJzaXRlOiBHb29kcyBWaXNpdCBTaXRlEAEYABABWgwyNGd4a2h5a2lqZmxyAiAAeACCARRzdWdnZXN0LmV6bmVoYjVlZzV0cpoBBggAEAAYALABALgBAMgBABiEwOismjMg7sTorJozMABCFHN1Z2dlc3QuZXpuZWhiNWVnNXRyIpMCCgtBQUFCcnR5RkNrURLdAQoLQUFBQnJ0eUZDa1ESC0FBQUJydHlGQ2tRGg0KCXRleHQvaHRtbBIAIg4KCnRleHQvcGxhaW4SACobIhUxMTcwNTM4NDg1MjU0NTczNDE3MTEoADgAMLWu56yaMzi1ruesmjNKOgokYXBwbGljYXRpb24vdm5kLmdvb2dsZS1hcHBzLmRvY3MubWRzGhLC19rkAQwaCgoGCgAQExgAEAFaDHppOG9oOGRkdWZuM3ICIAB4AIIBFHN1Z2dlc3QuOHB1cmI5bGNjMm82mgEGCAAQABgAsAEAuAEAyAEAGLWu56yaMyC1ruesmjMwAEIUc3VnZ2VzdC44cHVyYjlsY2MybzYyDmguaGJuYXN6cHUzMjVuMg5oLmQxZ3NmNGg3cmxoZTgAaiUKFHN1Z2dlc3QubTl5a3VnYnRlMXlxEg1NYWhlciBNb3N0YWZhaiUKFHN1Z2dlc3QuZDZ1M2c5dmp4cGd3Eg1NYWhlciBNb3N0YWZhaiQKE3N1Z2dlc3QudzN1dGxycTllazQSDU1haGVyIE1vc3RhZmFqJQoUc3VnZ2VzdC45dnk5NGp6NWd4ajkSDU1haGVyIE1vc3RhZmFqJQoUc3VnZ2VzdC5kbzZ4NXN2c2ExMnkSDU1haGVyIE1vc3RhZmFqJQoUc3VnZ2VzdC5kdDJydnNvYjlnY3gSDU1haGVyIE1vc3RhZmFqJQoUc3VnZ2VzdC55Yzk3MDB0NHlhOHoSDU1haGVyIE1vc3RhZmFqJAoTc3VnZ2VzdC55eTRnNzJhN2RlaxINTWFoZXIgTW9zdGFmYWolChRzdWdnZXN0LjNzcTRxdWZpbmNnYxINTWFoZXIgTW9zdGFmYWolChRzdWdnZXN0LnBwYzh5MTFxYXAxZhINTWFoZXIgTW9zdGFmYWolChRzdWdnZXN0LmV6bmVoYjVlZzV0chINTWFoZXIgTW9zdGFmYWolChRzdWdnZXN0LjhwdXJiOWxjYzJvNhINTWFoZXIgTW9zdGFmYXIhMTJDRGJJZmZ6bkJKQzkwUHV6aExQVnN5bzBpM2RfeE5u</go:docsCustomData>
+  <go:docsCustomData xmlns:go="http://customooxmlschemas.google.com/" roundtripDataSignature="AMtx7mgX/dXAYc6PIPPwH8D3Dx2tJENPjA==">CgMxLjAaHQoBMBIYChYIB0ISEhBBcmlhbCBVbmljb2RlIE1TGh0KATESGAoWCAdCEhIQQXJpYWwgVW5pY29kZSBNUxodCgEyEhgKFggHQhISEEFyaWFsIFVuaWNvZGUgTVMaHQoBMxIYChYIB0ISEhBBcmlhbCBVbmljb2RlIE1TGh0KATQSGAoWCAdCEhIQQXJpYWwgVW5pY29kZSBNUxodCgE1EhgKFggHQhISEEFyaWFsIFVuaWNvZGUgTVMaHQoBNhIYChYIB0ISEhBBcmlhbCBVbmljb2RlIE1TIpsCCgtBQUFCcnR5RkNrZxLmAQoLQUFBQnJ0eUZDa2cSC0FBQUJydHlGQ2tnGg0KCXRleHQvaHRtbBIAIg4KCnRleHQvcGxhaW4SACobIhUxMTcwNTM4NDg1MjU0NTczNDE3MTEoADgAMJ7i6ayaMzjS5umsmjNKRAokYXBwbGljYXRpb24vdm5kLmdvb2dsZS1hcHBzLmRvY3MubWRzGhzC19rkARYKFAoHCgE9EAEYABIHCgEuEAEYABgBWgxvNHpxdnN5ZjlocTdyAiAAeACCARNzdWdnZXN0LnczdXRscnE5ZWs0mgEGCAAQABgAsAEAuAEAyAEAGJ7i6ayaMyDS5umsmjMwAEITc3VnZ2VzdC53M3V0bHJxOWVrNCKTAgoLQUFBQnJ0eUZDa0US3QEKC0FBQUJydHlGQ2tFEgtBQUFCcnR5RkNrRRoNCgl0ZXh0L2h0bWwSACIOCgp0ZXh0L3BsYWluEgAqGyIVMTE3MDUzODQ4NTI1NDU3MzQxNzExKAA4ADCUzeasmjM4ydLmrJozSjoKJGFwcGxpY2F0aW9uL3ZuZC5nb29nbGUtYXBwcy5kb2NzLm1kcxoSwtfa5AEMGgoKBgoAEBQYABABWgxvcXg2Njkxa3RnbzdyAiAAeACCARRzdWdnZXN0LmRvNng1c3ZzYTEyeZoBBggAEAAYALABALgBAMgBABiUzeasmjMgydLmrJozMABCFHN1Z2dlc3QuZG82eDVzdnNhMTJ5IqMCCgtBQUFCcnR5RkNrTRLtAQoLQUFBQnJ0eUZDa00SC0FBQUJydHlGQ2tNGg0KCXRleHQvaHRtbBIAIg4KCnRleHQvcGxhaW4SACobIhUxMTcwNTM4NDg1MjU0NTczNDE3MTEoADgAMN6n56yaMziPrOesmjNKSgokYXBwbGljYXRpb24vdm5kLmdvb2dsZS1hcHBzLmRvY3MubWRzGiLC19rkARwSGgoWChBHb29kcyBWaXNpdCBTaXRlEAEYABABWgx6YnF6eWVzMWF0a29yAiAAeACCARRzdWdnZXN0LmR0MnJ2c29iOWdjeJoBBggAEAAYALABALgBAMgBABjep+esmjMgj6znrJozMABCFHN1Z2dlc3QuZHQycnZzb2I5Z2N4IpECCgtBQUFCcnR5RkNrSRLcAQoLQUFBQnJ0eUZDa0kSC0FBQUJydHlGQ2tJGg0KCXRleHQvaHRtbBIAIg4KCnRleHQvcGxhaW4SACobIhUxMTcwNTM4NDg1MjU0NTczNDE3MTEoADgAMMDr5qyaMzj48OasmjNKOgokYXBwbGljYXRpb24vdm5kLmdvb2dsZS1hcHBzLmRvY3MubWRzGhLC19rkAQwaCgoGCgAQExgAEAFaDG5nMGdycHV4Z3Rrc3ICIAB4AIIBE3N1Z2dlc3QueXk0ZzcyYTdkZWuaAQYIABAAGACwAQC4AQDIAQAYwOvmrJozIPjw5qyaMzAAQhNzdWdnZXN0Lnl5NGc3MmE3ZGVrIp8CCgtBQUFCcnR5RkNqZxLpAQoLQUFBQnJ0eUZDamcSC0FBQUJydHlGQ2pnGg0KCXRleHQvaHRtbBIAIg4KCnRleHQvcGxhaW4SACobIhUxMTcwNTM4NDg1MjU0NTczNDE3MTEoADgAMLOr36yaMzjAut+smjNKRwokYXBwbGljYXRpb24vdm5kLmdvb2dsZS1hcHBzLmRvY3MubWRzGh/C19rkARkaCgoGCgAQFBgAEAMaCwoHCgEtEAEYABABWgs1Z2I3bHNtNjh2cXICIAB4AIIBFHN1Z2dlc3QuM3NxNHF1ZmluY2djmgEGCAAQABgAsAEAuAEAyAEAGLOr36yaMyDAut+smjMwAEIUc3VnZ2VzdC4zc3E0cXVmaW5jZ2MipAIKC0FBQUJya2s4VXljEu4BCgtBQUFCcmtrOFV5YxILQUFBQnJrazhVeWMaDQoJdGV4dC9odG1sEgAiDgoKdGV4dC9wbGFpbhIAKhsiFTExNzA1Mzg0ODUyNTQ1NzM0MTcxMSgAOAAw8+r+2pgzOJ6M/9qYM0pLCiRhcHBsaWNhdGlvbi92bmQuZ29vZ2xlLWFwcHMuZG9jcy5tZHMaI8LX2uQBHRobChcKEWh0dHBzOi8vZ29vZHMuZWcvEAgYABABWgxqd3cyeGZpaXUyZ3JyAiAAeACCARRzdWdnZXN0LnBwYzh5MTFxYXAxZpoBBggAEAAYALABALgBAMgBABjz6v7amDMgnoz/2pgzMABCFHN1Z2dlc3QucHBjOHkxMXFhcDFmIrACCgtBQUFCcnR5RkNrVRL6AQoLQUFBQnJ0eUZDa1USC0FBQUJydHlGQ2tVGg0KCXRleHQvaHRtbBIAIg4KCnRleHQvcGxhaW4SACobIhUxMTcwNTM4NDg1MjU0NTczNDE3MTEoADgAMITA6KyaMzjuxOismjNKVwokYXBwbGljYXRpb24vdm5kLmdvb2dsZS1hcHBzLmRvY3MubWRzGi/C19rkASkSJwojCh3il48gV2Vic2l0ZTogR29vZHMgVmlzaXQgU2l0ZRABGAAQAVoMMjRneGtoeWtpamZscgIgAHgAggEUc3VnZ2VzdC5lem5laGI1ZWc1dHKaAQYIABAAGACwAQC4AQDIAQAYhMDorJozIO7E6KyaMzAAQhRzdWdnZXN0LmV6bmVoYjVlZzV0ciKTAgoLQUFBQnJ0eUZDa1ES3QEKC0FBQUJydHlGQ2tREgtBQUFCcnR5RkNrURoNCgl0ZXh0L2h0bWwSACIOCgp0ZXh0L3BsYWluEgAqGyIVMTE3MDUzODQ4NTI1NDU3MzQxNzExKAA4ADC1ruesmjM4ta7nrJozSjoKJGFwcGxpY2F0aW9uL3ZuZC5nb29nbGUtYXBwcy5kb2NzLm1kcxoSwtfa5AEMGgoKBgoAEBMYABABWgx6aThvaDhkZHVmbjNyAiAAeACCARRzdWdnZXN0LjhwdXJiOWxjYzJvNpoBBggAEAAYALABALgBAMgBABi1ruesmjMgta7nrJozMABCFHN1Z2dlc3QuOHB1cmI5bGNjMm82Mg5oLmhibmFzenB1MzI1bjIOaC5kMWdzZjRoN3JsaGU4AGolChRzdWdnZXN0Lm05eWt1Z2J0ZTF5cRINTWFoZXIgTW9zdGFmYWolChRzdWdnZXN0LmQ2dTNnOXZqeHBndxINTWFoZXIgTW9zdGFmYWokChNzdWdnZXN0LnczdXRscnE5ZWs0Eg1NYWhlciBNb3N0YWZhaiUKFHN1Z2dlc3QuOXZ5OTRqejVneGo5Eg1NYWhlciBNb3N0YWZhaiUKFHN1Z2dlc3QuZG82eDVzdnNhMTJ5Eg1NYWhlciBNb3N0YWZhaiUKFHN1Z2dlc3QuZHQycnZzb2I5Z2N4Eg1NYWhlciBNb3N0YWZhaiUKFHN1Z2dlc3QueWM5NzAwdDR5YTh6Eg1NYWhlciBNb3N0YWZhaiQKE3N1Z2dlc3QueXk0ZzcyYTdkZWsSDU1haGVyIE1vc3RhZmFqJQoUc3VnZ2VzdC4zc3E0cXVmaW5jZ2MSDU1haGVyIE1vc3RhZmFqJQoUc3VnZ2VzdC5wcGM4eTExcWFwMWYSDU1haGVyIE1vc3RhZmFqJQoUc3VnZ2VzdC5lem5laGI1ZWc1dHISDU1haGVyIE1vc3RhZmFqJQoUc3VnZ2VzdC44cHVyYjlsY2MybzYSDU1haGVyIE1vc3RhZmFyITEyQ0RiSWZmem5CSkM5MFB1emhMUFZzeW8waTNkX3hObg==</go:docsCustomData>
 </go:gDocsCustomXmlDataStorage>
 </file>
 

</xml_diff>

<commit_message>
Update CV documents with additional revisions in Word and PDF formats.
</commit_message>
<xml_diff>
--- a/Maher Mostafa Cv.docx
+++ b/Maher Mostafa Cv.docx
@@ -363,7 +363,7 @@
             <w:u w:val="single"/>
             <w:rtl w:val="0"/>
           </w:rPr>
-          <w:t xml:space="preserve">Linkedin</w:t>
+          <w:t xml:space="preserve">LinkedIn</w:t>
         </w:r>
       </w:hyperlink>
       <w:r>
@@ -850,7 +850,7 @@
       </w:pPr>
       <w:sdt>
         <w:sdtPr>
-          <w:id w:val="-1266877917"/>
+          <w:id w:val="60635852"/>
           <w:tag w:val="goog_rdk_0"/>
         </w:sdtPr>
         <w:sdtContent>
@@ -896,7 +896,7 @@
       </w:pPr>
       <w:sdt>
         <w:sdtPr>
-          <w:id w:val="889170496"/>
+          <w:id w:val="890494070"/>
           <w:tag w:val="goog_rdk_1"/>
         </w:sdtPr>
         <w:sdtContent>
@@ -950,7 +950,7 @@
       </w:pPr>
       <w:sdt>
         <w:sdtPr>
-          <w:id w:val="2142494234"/>
+          <w:id w:val="1726883663"/>
           <w:tag w:val="goog_rdk_2"/>
         </w:sdtPr>
         <w:sdtContent>
@@ -996,7 +996,7 @@
       </w:pPr>
       <w:sdt>
         <w:sdtPr>
-          <w:id w:val="-308801394"/>
+          <w:id w:val="-758939768"/>
           <w:tag w:val="goog_rdk_3"/>
         </w:sdtPr>
         <w:sdtContent>
@@ -1042,7 +1042,7 @@
       </w:pPr>
       <w:sdt>
         <w:sdtPr>
-          <w:id w:val="-727096909"/>
+          <w:id w:val="763208482"/>
           <w:tag w:val="goog_rdk_4"/>
         </w:sdtPr>
         <w:sdtContent>
@@ -1073,7 +1073,7 @@
           <w:szCs w:val="15"/>
           <w:rtl w:val="0"/>
         </w:rPr>
-        <w:t xml:space="preserve">Docker, GitHub ActionS</w:t>
+        <w:t xml:space="preserve">Docker, GitHub Actions</w:t>
       </w:r>
       <w:r>
         <w:rPr>
@@ -1568,7 +1568,7 @@
       </w:pPr>
       <w:sdt>
         <w:sdtPr>
-          <w:id w:val="1523908736"/>
+          <w:id w:val="39392415"/>
           <w:tag w:val="goog_rdk_5"/>
         </w:sdtPr>
         <w:sdtContent>
@@ -1669,7 +1669,7 @@
       </w:pPr>
       <w:sdt>
         <w:sdtPr>
-          <w:id w:val="497687005"/>
+          <w:id w:val="1400176756"/>
           <w:tag w:val="goog_rdk_6"/>
         </w:sdtPr>
         <w:sdtContent>

</xml_diff>

<commit_message>
Update CV documents with further revisions in Word and PDF formats.
</commit_message>
<xml_diff>
--- a/Maher Mostafa Cv.docx
+++ b/Maher Mostafa Cv.docx
@@ -850,7 +850,7 @@
       </w:pPr>
       <w:sdt>
         <w:sdtPr>
-          <w:id w:val="60635852"/>
+          <w:id w:val="-665096903"/>
           <w:tag w:val="goog_rdk_0"/>
         </w:sdtPr>
         <w:sdtContent>
@@ -896,7 +896,7 @@
       </w:pPr>
       <w:sdt>
         <w:sdtPr>
-          <w:id w:val="890494070"/>
+          <w:id w:val="-1293548741"/>
           <w:tag w:val="goog_rdk_1"/>
         </w:sdtPr>
         <w:sdtContent>
@@ -950,7 +950,7 @@
       </w:pPr>
       <w:sdt>
         <w:sdtPr>
-          <w:id w:val="1726883663"/>
+          <w:id w:val="-114111"/>
           <w:tag w:val="goog_rdk_2"/>
         </w:sdtPr>
         <w:sdtContent>
@@ -996,7 +996,7 @@
       </w:pPr>
       <w:sdt>
         <w:sdtPr>
-          <w:id w:val="-758939768"/>
+          <w:id w:val="-2062797498"/>
           <w:tag w:val="goog_rdk_3"/>
         </w:sdtPr>
         <w:sdtContent>
@@ -1042,7 +1042,7 @@
       </w:pPr>
       <w:sdt>
         <w:sdtPr>
-          <w:id w:val="763208482"/>
+          <w:id w:val="-1039355130"/>
           <w:tag w:val="goog_rdk_4"/>
         </w:sdtPr>
         <w:sdtContent>
@@ -1497,7 +1497,7 @@
           <w:szCs w:val="15"/>
           <w:rtl w:val="0"/>
         </w:rPr>
-        <w:t xml:space="preserve">• Built PostgreSQL CTE-based invoicing and credit reports with unit-tested query logic; delivered Docker, health checks, GitHub Actions test gating, semver tagging, and AWS ECR image publishing.</w:t>
+        <w:t xml:space="preserve">• Built PostgreSQL CTE-based invoicing and credit reports with unit-tested query logic; delivered Docker, health checks, GitHub Actions test gating, semver tagging.</w:t>
       </w:r>
     </w:p>
     <w:p>
@@ -1568,7 +1568,7 @@
       </w:pPr>
       <w:sdt>
         <w:sdtPr>
-          <w:id w:val="39392415"/>
+          <w:id w:val="1271482665"/>
           <w:tag w:val="goog_rdk_5"/>
         </w:sdtPr>
         <w:sdtContent>
@@ -1669,7 +1669,7 @@
       </w:pPr>
       <w:sdt>
         <w:sdtPr>
-          <w:id w:val="1400176756"/>
+          <w:id w:val="161552732"/>
           <w:tag w:val="goog_rdk_6"/>
         </w:sdtPr>
         <w:sdtContent>

</xml_diff>